<commit_message>
le travail est mis à jour compte tenu de vos remarques
</commit_message>
<xml_diff>
--- a/Bibliothèque_Numérique_Et_Physique_Accessible.docx
+++ b/Bibliothèque_Numérique_Et_Physique_Accessible.docx
@@ -6,15 +6,13 @@
       <w:pPr>
         <w:pStyle w:val="Titre1"/>
       </w:pPr>
-      <w:bookmarkStart w:id="0" w:name="_GoBack"/>
-      <w:bookmarkEnd w:id="0"/>
       <w:r>
         <w:rPr>
           <w:rStyle w:val="lev"/>
           <w:b/>
           <w:bCs/>
         </w:rPr>
-        <w:t>– Bibliothèque numérique et physique accessible</w:t>
+        <w:t>Bibliothèque numérique et physique accessible – Version finale</w:t>
       </w:r>
     </w:p>
     <w:p>
@@ -38,47 +36,117 @@
         <w:rPr>
           <w:rStyle w:val="font-ligatures-none"/>
         </w:rPr>
-        <w:t xml:space="preserve">Créer une </w:t>
+        <w:t xml:space="preserve">Le projet vise à concevoir une </w:t>
       </w:r>
       <w:r>
         <w:rPr>
           <w:rStyle w:val="lev"/>
         </w:rPr>
-        <w:t>bibliothèque hybride (</w:t>
+        <w:t>bibliothèque hybride</w:t>
+      </w:r>
+      <w:r>
+        <w:rPr>
+          <w:rStyle w:val="font-ligatures-none"/>
+        </w:rPr>
+        <w:t xml:space="preserve">, accessible en présentiel et en </w:t>
       </w:r>
       <w:proofErr w:type="spellStart"/>
       <w:r>
         <w:rPr>
+          <w:rStyle w:val="font-ligatures-none"/>
+        </w:rPr>
+        <w:t>distanciel</w:t>
+      </w:r>
+      <w:proofErr w:type="spellEnd"/>
+      <w:r>
+        <w:rPr>
+          <w:rStyle w:val="font-ligatures-none"/>
+        </w:rPr>
+        <w:t>, permettant à tous les publics — y compris les personnes en situation de handicap visuel, auditif, moteur ou cognitif — d’accéder à des œuvres littéraires dans des formats adaptés. Cette bibliothèque a pour ambition de :</w:t>
+      </w:r>
+    </w:p>
+    <w:p>
+      <w:pPr>
+        <w:pStyle w:val="NormalWeb"/>
+        <w:numPr>
+          <w:ilvl w:val="0"/>
+          <w:numId w:val="1"/>
+        </w:numPr>
+      </w:pPr>
+      <w:r>
+        <w:rPr>
           <w:rStyle w:val="lev"/>
         </w:rPr>
-        <w:t>présenciel</w:t>
-      </w:r>
-      <w:proofErr w:type="spellEnd"/>
+        <w:t>Garantir l’égalité d’accès à la lecture</w:t>
+      </w:r>
+      <w:r>
+        <w:rPr>
+          <w:rStyle w:val="font-ligatures-none"/>
+        </w:rPr>
+        <w:t>, en proposant des supports variés : texte accessible, audio, braille numérique, résumés en braille papier.</w:t>
+      </w:r>
+    </w:p>
+    <w:p>
+      <w:pPr>
+        <w:pStyle w:val="NormalWeb"/>
+        <w:numPr>
+          <w:ilvl w:val="0"/>
+          <w:numId w:val="1"/>
+        </w:numPr>
+      </w:pPr>
       <w:r>
         <w:rPr>
           <w:rStyle w:val="lev"/>
         </w:rPr>
-        <w:t xml:space="preserve"> + </w:t>
-      </w:r>
-      <w:proofErr w:type="spellStart"/>
+        <w:t>Offrir une expérience inclusive</w:t>
+      </w:r>
+      <w:r>
+        <w:rPr>
+          <w:rStyle w:val="font-ligatures-none"/>
+        </w:rPr>
+        <w:t>, grâce à une interface numérique conforme aux normes d’accessibilité (RGAA, ARIA) et à un espace physique équipé de matériel spécialisé (plages braille, cabines audio, mobilier adapté).</w:t>
+      </w:r>
+    </w:p>
+    <w:p>
+      <w:pPr>
+        <w:pStyle w:val="NormalWeb"/>
+        <w:numPr>
+          <w:ilvl w:val="0"/>
+          <w:numId w:val="1"/>
+        </w:numPr>
+      </w:pPr>
       <w:r>
         <w:rPr>
           <w:rStyle w:val="lev"/>
         </w:rPr>
-        <w:t>distanciel</w:t>
-      </w:r>
-      <w:proofErr w:type="spellEnd"/>
+        <w:t>Respecter les obligations légales et éthiques</w:t>
+      </w:r>
+      <w:r>
+        <w:rPr>
+          <w:rStyle w:val="font-ligatures-none"/>
+        </w:rPr>
+        <w:t>, notamment le Traité de Marrakech, en facilitant l’accès aux œuvres pour les personnes empêchées de lire un livre imprimé.</w:t>
+      </w:r>
+    </w:p>
+    <w:p>
+      <w:pPr>
+        <w:pStyle w:val="NormalWeb"/>
+        <w:numPr>
+          <w:ilvl w:val="0"/>
+          <w:numId w:val="1"/>
+        </w:numPr>
+      </w:pPr>
       <w:r>
         <w:rPr>
           <w:rStyle w:val="lev"/>
         </w:rPr>
-        <w:t>)</w:t>
-      </w:r>
-      <w:r>
-        <w:rPr>
-          <w:rStyle w:val="font-ligatures-none"/>
-        </w:rPr>
-        <w:t xml:space="preserve"> entièrement accessible, permettant :</w:t>
+        <w:t>Protéger les droits des auteurs</w:t>
+      </w:r>
+      <w:r>
+        <w:rPr>
+          <w:rStyle w:val="font-ligatures-none"/>
+        </w:rPr>
+        <w:t>, via des mécanismes avancés de sécurité empêchant le téléchargement, la copie ou la capture des contenus.</w:t>
       </w:r>
     </w:p>
     <w:p>
@@ -89,213 +157,22 @@
           <w:numId w:val="1"/>
         </w:numPr>
       </w:pPr>
-      <w:proofErr w:type="gramStart"/>
-      <w:r>
-        <w:rPr>
-          <w:rStyle w:val="font-ligatures-none"/>
-        </w:rPr>
-        <w:t>la</w:t>
-      </w:r>
-      <w:proofErr w:type="gramEnd"/>
-      <w:r>
-        <w:rPr>
-          <w:rStyle w:val="font-ligatures-none"/>
-        </w:rPr>
-        <w:t xml:space="preserve"> consultation de livres numériques accessibles (texte, audio, braille numérique) ;</w:t>
-      </w:r>
-    </w:p>
-    <w:p>
-      <w:pPr>
-        <w:pStyle w:val="NormalWeb"/>
-        <w:numPr>
-          <w:ilvl w:val="0"/>
-          <w:numId w:val="1"/>
-        </w:numPr>
-      </w:pPr>
-      <w:proofErr w:type="gramStart"/>
-      <w:r>
-        <w:rPr>
-          <w:rStyle w:val="font-ligatures-none"/>
-        </w:rPr>
-        <w:t>la</w:t>
-      </w:r>
-      <w:proofErr w:type="gramEnd"/>
-      <w:r>
-        <w:rPr>
-          <w:rStyle w:val="font-ligatures-none"/>
-        </w:rPr>
-        <w:t xml:space="preserve"> lecture en braille sur place via </w:t>
-      </w:r>
       <w:r>
         <w:rPr>
           <w:rStyle w:val="lev"/>
         </w:rPr>
-        <w:t>plages braille</w:t>
-      </w:r>
-      <w:r>
-        <w:rPr>
-          <w:rStyle w:val="font-ligatures-none"/>
-        </w:rPr>
-        <w:t xml:space="preserve"> ;</w:t>
-      </w:r>
-    </w:p>
-    <w:p>
-      <w:pPr>
-        <w:pStyle w:val="NormalWeb"/>
-        <w:numPr>
-          <w:ilvl w:val="0"/>
-          <w:numId w:val="1"/>
-        </w:numPr>
-      </w:pPr>
-      <w:proofErr w:type="gramStart"/>
-      <w:r>
-        <w:rPr>
-          <w:rStyle w:val="font-ligatures-none"/>
-        </w:rPr>
-        <w:t>la</w:t>
-      </w:r>
-      <w:proofErr w:type="gramEnd"/>
-      <w:r>
-        <w:rPr>
-          <w:rStyle w:val="font-ligatures-none"/>
-        </w:rPr>
-        <w:t xml:space="preserve"> mise à disposition de </w:t>
-      </w:r>
-      <w:r>
-        <w:rPr>
-          <w:rStyle w:val="lev"/>
-        </w:rPr>
-        <w:t>résumés en braille papier</w:t>
-      </w:r>
-      <w:r>
-        <w:rPr>
-          <w:rStyle w:val="font-ligatures-none"/>
-        </w:rPr>
-        <w:t xml:space="preserve"> pour les ouvrages volumineux ;</w:t>
-      </w:r>
-    </w:p>
-    <w:p>
-      <w:pPr>
-        <w:pStyle w:val="NormalWeb"/>
-        <w:numPr>
-          <w:ilvl w:val="0"/>
-          <w:numId w:val="1"/>
-        </w:numPr>
-      </w:pPr>
-      <w:proofErr w:type="gramStart"/>
-      <w:r>
-        <w:rPr>
-          <w:rStyle w:val="font-ligatures-none"/>
-        </w:rPr>
-        <w:t>l’accès</w:t>
-      </w:r>
-      <w:proofErr w:type="gramEnd"/>
-      <w:r>
-        <w:rPr>
-          <w:rStyle w:val="font-ligatures-none"/>
-        </w:rPr>
-        <w:t xml:space="preserve"> à des </w:t>
-      </w:r>
-      <w:r>
-        <w:rPr>
-          <w:rStyle w:val="lev"/>
-        </w:rPr>
-        <w:t>lectures audio réalisées par des donneurs de voix</w:t>
-      </w:r>
-      <w:r>
-        <w:rPr>
-          <w:rStyle w:val="font-ligatures-none"/>
-        </w:rPr>
-        <w:t xml:space="preserve"> ;</w:t>
-      </w:r>
-    </w:p>
-    <w:p>
-      <w:pPr>
-        <w:pStyle w:val="NormalWeb"/>
-        <w:numPr>
-          <w:ilvl w:val="0"/>
-          <w:numId w:val="1"/>
-        </w:numPr>
-      </w:pPr>
-      <w:proofErr w:type="gramStart"/>
-      <w:r>
-        <w:rPr>
-          <w:rStyle w:val="font-ligatures-none"/>
-        </w:rPr>
-        <w:t>la</w:t>
-      </w:r>
-      <w:proofErr w:type="gramEnd"/>
-      <w:r>
-        <w:rPr>
-          <w:rStyle w:val="font-ligatures-none"/>
-        </w:rPr>
-        <w:t xml:space="preserve"> prise en compte de </w:t>
-      </w:r>
-      <w:r>
-        <w:rPr>
-          <w:rStyle w:val="lev"/>
-        </w:rPr>
-        <w:t>tous les types de handicap</w:t>
-      </w:r>
-      <w:r>
-        <w:rPr>
-          <w:rStyle w:val="font-ligatures-none"/>
-        </w:rPr>
-        <w:t xml:space="preserve">, conformément au </w:t>
-      </w:r>
-      <w:r>
-        <w:rPr>
-          <w:rStyle w:val="lev"/>
-        </w:rPr>
-        <w:t>Traité de Marrakech</w:t>
-      </w:r>
-      <w:r>
-        <w:rPr>
-          <w:rStyle w:val="font-ligatures-none"/>
-        </w:rPr>
-        <w:t xml:space="preserve"> ;</w:t>
-      </w:r>
-    </w:p>
-    <w:p>
-      <w:pPr>
-        <w:pStyle w:val="NormalWeb"/>
-        <w:numPr>
-          <w:ilvl w:val="0"/>
-          <w:numId w:val="1"/>
-        </w:numPr>
-      </w:pPr>
-      <w:proofErr w:type="gramStart"/>
-      <w:r>
-        <w:rPr>
-          <w:rStyle w:val="font-ligatures-none"/>
-        </w:rPr>
-        <w:t>la</w:t>
-      </w:r>
-      <w:proofErr w:type="gramEnd"/>
-      <w:r>
-        <w:rPr>
-          <w:rStyle w:val="font-ligatures-none"/>
-        </w:rPr>
-        <w:t xml:space="preserve"> protection stricte des œuvres contre le piratage (anti</w:t>
-      </w:r>
-      <w:r>
-        <w:rPr>
-          <w:rStyle w:val="font-ligatures-none"/>
-        </w:rPr>
-        <w:noBreakHyphen/>
-        <w:t>téléchargement, anti</w:t>
-      </w:r>
-      <w:r>
-        <w:rPr>
-          <w:rStyle w:val="font-ligatures-none"/>
-        </w:rPr>
-        <w:noBreakHyphen/>
-        <w:t>capture).</w:t>
-      </w:r>
-    </w:p>
-    <w:p>
-      <w:pPr>
-        <w:pStyle w:val="Titre1"/>
+        <w:t>Développer un modèle de bibliothèque moderne</w:t>
+      </w:r>
+      <w:r>
+        <w:rPr>
+          <w:rStyle w:val="font-ligatures-none"/>
+        </w:rPr>
+        <w:t>, combinant innovation technologique, inclusion sociale et protection des œuvres.</w:t>
+      </w:r>
+    </w:p>
+    <w:p>
+      <w:pPr>
+        <w:pStyle w:val="Titre2"/>
       </w:pPr>
       <w:r>
         <w:rPr>
@@ -303,12 +180,110 @@
           <w:b/>
           <w:bCs/>
         </w:rPr>
-        <w:t>2. Publics concernés</w:t>
-      </w:r>
-    </w:p>
-    <w:p>
-      <w:pPr>
-        <w:pStyle w:val="Titre3"/>
+        <w:t>2. Contexte</w:t>
+      </w:r>
+    </w:p>
+    <w:p>
+      <w:pPr>
+        <w:pStyle w:val="NormalWeb"/>
+      </w:pPr>
+      <w:r>
+        <w:rPr>
+          <w:rStyle w:val="font-ligatures-none"/>
+        </w:rPr>
+        <w:t>L’accès à la lecture demeure un enjeu majeur pour de nombreuses personnes en situation de handicap. Les bibliothèques traditionnelles et les plateformes numériques ne proposent pas toujours des formats adaptés, ou ne respectent pas les normes d’accessibilité nécessaires pour garantir une expérience fluide et inclusive.</w:t>
+      </w:r>
+    </w:p>
+    <w:p>
+      <w:pPr>
+        <w:pStyle w:val="NormalWeb"/>
+      </w:pPr>
+      <w:r>
+        <w:rPr>
+          <w:rStyle w:val="font-ligatures-none"/>
+        </w:rPr>
+        <w:t>Les établissements physiques manquent souvent de matériel spécialisé (plages braille, cabines audio, mobilier adapté), ce qui limite l’autonomie des usagers déficients visuels ou ayant des difficultés motrices.</w:t>
+      </w:r>
+    </w:p>
+    <w:p>
+      <w:pPr>
+        <w:pStyle w:val="NormalWeb"/>
+      </w:pPr>
+      <w:r>
+        <w:rPr>
+          <w:rStyle w:val="font-ligatures-none"/>
+        </w:rPr>
+        <w:t xml:space="preserve">Parallèlement, les éditeurs et auteurs expriment une inquiétude croissante face au </w:t>
+      </w:r>
+      <w:r>
+        <w:rPr>
+          <w:rStyle w:val="lev"/>
+        </w:rPr>
+        <w:t>piratage des œuvres numériques</w:t>
+      </w:r>
+      <w:r>
+        <w:rPr>
+          <w:rStyle w:val="font-ligatures-none"/>
+        </w:rPr>
+        <w:t>, qui menace la diffusion légale et la rémunération des créateurs.</w:t>
+      </w:r>
+    </w:p>
+    <w:p>
+      <w:pPr>
+        <w:pStyle w:val="NormalWeb"/>
+      </w:pPr>
+      <w:r>
+        <w:rPr>
+          <w:rStyle w:val="font-ligatures-none"/>
+        </w:rPr>
+        <w:t>Ce projet répond donc à un double besoin :</w:t>
+      </w:r>
+    </w:p>
+    <w:p>
+      <w:pPr>
+        <w:pStyle w:val="NormalWeb"/>
+        <w:numPr>
+          <w:ilvl w:val="0"/>
+          <w:numId w:val="2"/>
+        </w:numPr>
+      </w:pPr>
+      <w:r>
+        <w:rPr>
+          <w:rStyle w:val="lev"/>
+        </w:rPr>
+        <w:t>Social et légal</w:t>
+      </w:r>
+      <w:r>
+        <w:rPr>
+          <w:rStyle w:val="font-ligatures-none"/>
+        </w:rPr>
+        <w:t xml:space="preserve"> : améliorer l’accessibilité des œuvres littéraires pour les publics empêchés de lire.</w:t>
+      </w:r>
+    </w:p>
+    <w:p>
+      <w:pPr>
+        <w:pStyle w:val="NormalWeb"/>
+        <w:numPr>
+          <w:ilvl w:val="0"/>
+          <w:numId w:val="2"/>
+        </w:numPr>
+      </w:pPr>
+      <w:r>
+        <w:rPr>
+          <w:rStyle w:val="lev"/>
+        </w:rPr>
+        <w:t>Technique et éthique</w:t>
+      </w:r>
+      <w:r>
+        <w:rPr>
+          <w:rStyle w:val="font-ligatures-none"/>
+        </w:rPr>
+        <w:t xml:space="preserve"> : protéger les contenus tout en les rendant disponibles dans des formats inclusifs.</w:t>
+      </w:r>
+    </w:p>
+    <w:p>
+      <w:pPr>
+        <w:pStyle w:val="Titre2"/>
       </w:pPr>
       <w:r>
         <w:rPr>
@@ -316,52 +291,7 @@
           <w:b/>
           <w:bCs/>
         </w:rPr>
-        <w:t>2.1. Déficients visuels</w:t>
-      </w:r>
-    </w:p>
-    <w:p>
-      <w:pPr>
-        <w:pStyle w:val="NormalWeb"/>
-        <w:numPr>
-          <w:ilvl w:val="0"/>
-          <w:numId w:val="2"/>
-        </w:numPr>
-      </w:pPr>
-      <w:r>
-        <w:rPr>
-          <w:rStyle w:val="font-ligatures-none"/>
-        </w:rPr>
-        <w:t>Aveugles (plage braille, lecteur d’écran, audio)</w:t>
-      </w:r>
-    </w:p>
-    <w:p>
-      <w:pPr>
-        <w:pStyle w:val="NormalWeb"/>
-        <w:numPr>
-          <w:ilvl w:val="0"/>
-          <w:numId w:val="2"/>
-        </w:numPr>
-      </w:pPr>
-      <w:r>
-        <w:rPr>
-          <w:rStyle w:val="font-ligatures-none"/>
-        </w:rPr>
-        <w:t>Malvoyants (contrastes, zoom, interface simplifiée)</w:t>
-      </w:r>
-    </w:p>
-    <w:p>
-      <w:pPr>
-        <w:pStyle w:val="NormalWeb"/>
-        <w:numPr>
-          <w:ilvl w:val="0"/>
-          <w:numId w:val="2"/>
-        </w:numPr>
-      </w:pPr>
-      <w:r>
-        <w:rPr>
-          <w:rStyle w:val="font-ligatures-none"/>
-        </w:rPr>
-        <w:t>Personnes ayant des difficultés à tenir un livre (Traité de Marrakech)</w:t>
+        <w:t>3. Problématiques</w:t>
       </w:r>
     </w:p>
     <w:p>
@@ -374,7 +304,30 @@
           <w:b/>
           <w:bCs/>
         </w:rPr>
-        <w:t>2.2. Déficients auditifs</w:t>
+        <w:t>3.1. Problématique 1 : Garantir un accès universel à la lecture</w:t>
+      </w:r>
+    </w:p>
+    <w:p>
+      <w:pPr>
+        <w:pStyle w:val="NormalWeb"/>
+      </w:pPr>
+      <w:r>
+        <w:rPr>
+          <w:rStyle w:val="font-ligatures-none"/>
+        </w:rPr>
+        <w:lastRenderedPageBreak/>
+        <w:t>Comment proposer une bibliothèque capable d’offrir une expérience de lecture adaptée à tous les publics, y compris ceux empêchés de lire un livre imprimé ?</w:t>
+      </w:r>
+    </w:p>
+    <w:p>
+      <w:pPr>
+        <w:pStyle w:val="NormalWeb"/>
+      </w:pPr>
+      <w:r>
+        <w:rPr>
+          <w:rStyle w:val="font-ligatures-none"/>
+        </w:rPr>
+        <w:t>Cette problématique implique :</w:t>
       </w:r>
     </w:p>
     <w:p>
@@ -389,14 +342,7 @@
         <w:rPr>
           <w:rStyle w:val="font-ligatures-none"/>
         </w:rPr>
-        <w:t>Sous</w:t>
-      </w:r>
-      <w:r>
-        <w:rPr>
-          <w:rStyle w:val="font-ligatures-none"/>
-        </w:rPr>
-        <w:noBreakHyphen/>
-        <w:t>titres pour les contenus vidéo</w:t>
+        <w:t>La création de formats accessibles (audio, braille numérique, résumés braille papier).</w:t>
       </w:r>
     </w:p>
     <w:p>
@@ -411,7 +357,7 @@
         <w:rPr>
           <w:rStyle w:val="font-ligatures-none"/>
         </w:rPr>
-        <w:t>Transcriptions textuelles des contenus audio</w:t>
+        <w:t>La mise en place d’une interface numérique conforme aux normes d’accessibilité.</w:t>
       </w:r>
     </w:p>
     <w:p>
@@ -426,7 +372,37 @@
         <w:rPr>
           <w:rStyle w:val="font-ligatures-none"/>
         </w:rPr>
-        <w:t>Interface visuelle claire et non dépendante du son</w:t>
+        <w:t>L’aménagement d’un espace physique permettant une consultation autonome.</w:t>
+      </w:r>
+    </w:p>
+    <w:p>
+      <w:pPr>
+        <w:pStyle w:val="NormalWeb"/>
+        <w:numPr>
+          <w:ilvl w:val="0"/>
+          <w:numId w:val="3"/>
+        </w:numPr>
+      </w:pPr>
+      <w:r>
+        <w:rPr>
+          <w:rStyle w:val="font-ligatures-none"/>
+        </w:rPr>
+        <w:t>La prise en compte de handicaps variés : visuels, auditifs, moteurs, cognitifs.</w:t>
+      </w:r>
+    </w:p>
+    <w:p>
+      <w:pPr>
+        <w:pStyle w:val="NormalWeb"/>
+        <w:numPr>
+          <w:ilvl w:val="0"/>
+          <w:numId w:val="3"/>
+        </w:numPr>
+      </w:pPr>
+      <w:r>
+        <w:rPr>
+          <w:rStyle w:val="font-ligatures-none"/>
+        </w:rPr>
+        <w:t>Le respect du Traité de Marrakech.</w:t>
       </w:r>
     </w:p>
     <w:p>
@@ -439,56 +415,181 @@
           <w:b/>
           <w:bCs/>
         </w:rPr>
-        <w:t xml:space="preserve">2.3. Déficients </w:t>
+        <w:t>3.2. Problématique 2 : Protéger les œuvres tout en les rendant accessibles</w:t>
+      </w:r>
+    </w:p>
+    <w:p>
+      <w:pPr>
+        <w:pStyle w:val="NormalWeb"/>
+      </w:pPr>
+      <w:r>
+        <w:rPr>
+          <w:rStyle w:val="font-ligatures-none"/>
+        </w:rPr>
+        <w:t>Comment garantir la sécurité des contenus numériques, tout en permettant leur consultation dans des formats adaptés ?</w:t>
+      </w:r>
+    </w:p>
+    <w:p>
+      <w:pPr>
+        <w:pStyle w:val="NormalWeb"/>
+      </w:pPr>
+      <w:r>
+        <w:rPr>
+          <w:rStyle w:val="font-ligatures-none"/>
+        </w:rPr>
+        <w:t>Cette problématique nécessite :</w:t>
+      </w:r>
+    </w:p>
+    <w:p>
+      <w:pPr>
+        <w:pStyle w:val="NormalWeb"/>
+        <w:numPr>
+          <w:ilvl w:val="0"/>
+          <w:numId w:val="4"/>
+        </w:numPr>
+      </w:pPr>
+      <w:r>
+        <w:rPr>
+          <w:rStyle w:val="font-ligatures-none"/>
+        </w:rPr>
+        <w:t xml:space="preserve">Des mécanismes de sécurité avancés (DRM, </w:t>
       </w:r>
       <w:proofErr w:type="spellStart"/>
+      <w:r>
+        <w:rPr>
+          <w:rStyle w:val="font-ligatures-none"/>
+        </w:rPr>
+        <w:t>watermark</w:t>
+      </w:r>
+      <w:proofErr w:type="spellEnd"/>
+      <w:r>
+        <w:rPr>
+          <w:rStyle w:val="font-ligatures-none"/>
+        </w:rPr>
+        <w:t xml:space="preserve"> dynamique, anti</w:t>
+      </w:r>
+      <w:r>
+        <w:rPr>
+          <w:rStyle w:val="font-ligatures-none"/>
+        </w:rPr>
+        <w:noBreakHyphen/>
+        <w:t>capture).</w:t>
+      </w:r>
+    </w:p>
+    <w:p>
+      <w:pPr>
+        <w:pStyle w:val="NormalWeb"/>
+        <w:numPr>
+          <w:ilvl w:val="0"/>
+          <w:numId w:val="4"/>
+        </w:numPr>
+      </w:pPr>
+      <w:r>
+        <w:rPr>
+          <w:rStyle w:val="font-ligatures-none"/>
+        </w:rPr>
+        <w:t>Un système de lecture en streaming sans possibilité de téléchargement.</w:t>
+      </w:r>
+    </w:p>
+    <w:p>
+      <w:pPr>
+        <w:pStyle w:val="NormalWeb"/>
+        <w:numPr>
+          <w:ilvl w:val="0"/>
+          <w:numId w:val="4"/>
+        </w:numPr>
+      </w:pPr>
+      <w:r>
+        <w:rPr>
+          <w:rStyle w:val="font-ligatures-none"/>
+        </w:rPr>
+        <w:t>Une gestion stricte des droits d’accès et des rôles utilisateurs.</w:t>
+      </w:r>
+    </w:p>
+    <w:p>
+      <w:pPr>
+        <w:pStyle w:val="NormalWeb"/>
+        <w:numPr>
+          <w:ilvl w:val="0"/>
+          <w:numId w:val="4"/>
+        </w:numPr>
+      </w:pPr>
+      <w:r>
+        <w:rPr>
+          <w:rStyle w:val="font-ligatures-none"/>
+        </w:rPr>
+        <w:t>Une architecture technique robuste et sécurisée.</w:t>
+      </w:r>
+    </w:p>
+    <w:p>
+      <w:pPr>
+        <w:pStyle w:val="Titre2"/>
+      </w:pPr>
       <w:r>
         <w:rPr>
           <w:rStyle w:val="lev"/>
           <w:b/>
           <w:bCs/>
         </w:rPr>
-        <w:t>verbo</w:t>
-      </w:r>
-      <w:proofErr w:type="spellEnd"/>
+        <w:t>4. Publics concernés</w:t>
+      </w:r>
+    </w:p>
+    <w:p>
+      <w:pPr>
+        <w:pStyle w:val="Titre3"/>
+      </w:pPr>
       <w:r>
         <w:rPr>
           <w:rStyle w:val="lev"/>
           <w:b/>
           <w:bCs/>
         </w:rPr>
-        <w:noBreakHyphen/>
-        <w:t>auditifs</w:t>
-      </w:r>
-    </w:p>
-    <w:p>
-      <w:pPr>
-        <w:pStyle w:val="NormalWeb"/>
-        <w:numPr>
-          <w:ilvl w:val="0"/>
-          <w:numId w:val="4"/>
-        </w:numPr>
-      </w:pPr>
-      <w:r>
-        <w:rPr>
-          <w:rStyle w:val="font-ligatures-none"/>
-        </w:rPr>
-        <w:t>Contenus textuels simplifiés</w:t>
-      </w:r>
-    </w:p>
-    <w:p>
-      <w:pPr>
-        <w:pStyle w:val="NormalWeb"/>
-        <w:numPr>
-          <w:ilvl w:val="0"/>
-          <w:numId w:val="4"/>
-        </w:numPr>
-      </w:pPr>
-      <w:r>
-        <w:rPr>
-          <w:rStyle w:val="font-ligatures-none"/>
-        </w:rPr>
-        <w:t>Navigation visuelle intuitive</w:t>
+        <w:t>4.1. Déficients visuels</w:t>
+      </w:r>
+    </w:p>
+    <w:p>
+      <w:pPr>
+        <w:pStyle w:val="NormalWeb"/>
+        <w:numPr>
+          <w:ilvl w:val="0"/>
+          <w:numId w:val="5"/>
+        </w:numPr>
+      </w:pPr>
+      <w:r>
+        <w:rPr>
+          <w:rStyle w:val="font-ligatures-none"/>
+        </w:rPr>
+        <w:t>Aveugles (plage braille, lecteur d’écran, audio)</w:t>
+      </w:r>
+    </w:p>
+    <w:p>
+      <w:pPr>
+        <w:pStyle w:val="NormalWeb"/>
+        <w:numPr>
+          <w:ilvl w:val="0"/>
+          <w:numId w:val="5"/>
+        </w:numPr>
+      </w:pPr>
+      <w:r>
+        <w:rPr>
+          <w:rStyle w:val="font-ligatures-none"/>
+        </w:rPr>
+        <w:t>Malvoyants (contrastes, zoom, interface simplifiée)</w:t>
+      </w:r>
+    </w:p>
+    <w:p>
+      <w:pPr>
+        <w:pStyle w:val="NormalWeb"/>
+        <w:numPr>
+          <w:ilvl w:val="0"/>
+          <w:numId w:val="5"/>
+        </w:numPr>
+      </w:pPr>
+      <w:r>
+        <w:rPr>
+          <w:rStyle w:val="font-ligatures-none"/>
+        </w:rPr>
+        <w:t>Personnes ayant des difficultés à tenir un livre (Traité de Marrakech)</w:t>
       </w:r>
     </w:p>
     <w:p>
@@ -501,27 +602,57 @@
           <w:b/>
           <w:bCs/>
         </w:rPr>
-        <w:t>2.4. Public général</w:t>
-      </w:r>
-    </w:p>
-    <w:p>
-      <w:pPr>
-        <w:pStyle w:val="NormalWeb"/>
-        <w:numPr>
-          <w:ilvl w:val="0"/>
-          <w:numId w:val="5"/>
-        </w:numPr>
-      </w:pPr>
-      <w:r>
-        <w:rPr>
-          <w:rStyle w:val="font-ligatures-none"/>
-        </w:rPr>
-        <w:t>Interface universelle, simple, inclusive</w:t>
-      </w:r>
-    </w:p>
-    <w:p>
-      <w:pPr>
-        <w:pStyle w:val="Titre1"/>
+        <w:t>4.2. Déficients auditifs</w:t>
+      </w:r>
+    </w:p>
+    <w:p>
+      <w:pPr>
+        <w:pStyle w:val="NormalWeb"/>
+        <w:numPr>
+          <w:ilvl w:val="0"/>
+          <w:numId w:val="6"/>
+        </w:numPr>
+      </w:pPr>
+      <w:r>
+        <w:rPr>
+          <w:rStyle w:val="font-ligatures-none"/>
+        </w:rPr>
+        <w:t>Sous-titres pour les contenus vidéo</w:t>
+      </w:r>
+    </w:p>
+    <w:p>
+      <w:pPr>
+        <w:pStyle w:val="NormalWeb"/>
+        <w:numPr>
+          <w:ilvl w:val="0"/>
+          <w:numId w:val="6"/>
+        </w:numPr>
+      </w:pPr>
+      <w:r>
+        <w:rPr>
+          <w:rStyle w:val="font-ligatures-none"/>
+        </w:rPr>
+        <w:t>Transcriptions textuelles des contenus audio</w:t>
+      </w:r>
+    </w:p>
+    <w:p>
+      <w:pPr>
+        <w:pStyle w:val="NormalWeb"/>
+        <w:numPr>
+          <w:ilvl w:val="0"/>
+          <w:numId w:val="6"/>
+        </w:numPr>
+      </w:pPr>
+      <w:r>
+        <w:rPr>
+          <w:rStyle w:val="font-ligatures-none"/>
+        </w:rPr>
+        <w:t>Interface visuelle claire</w:t>
+      </w:r>
+    </w:p>
+    <w:p>
+      <w:pPr>
+        <w:pStyle w:val="Titre3"/>
       </w:pPr>
       <w:r>
         <w:rPr>
@@ -529,43 +660,88 @@
           <w:b/>
           <w:bCs/>
         </w:rPr>
-        <w:t>3. Fonctionnalités (version enrichie)</w:t>
-      </w:r>
-    </w:p>
-    <w:p>
-      <w:pPr>
-        <w:pStyle w:val="Titre2"/>
-      </w:pPr>
+        <w:t xml:space="preserve">4.3. Déficients </w:t>
+      </w:r>
+      <w:proofErr w:type="spellStart"/>
       <w:r>
         <w:rPr>
           <w:rStyle w:val="lev"/>
           <w:b/>
           <w:bCs/>
         </w:rPr>
-        <w:t xml:space="preserve">3.1. Fonctionnalités en </w:t>
-      </w:r>
-      <w:proofErr w:type="spellStart"/>
+        <w:t>verbo</w:t>
+      </w:r>
+      <w:proofErr w:type="spellEnd"/>
       <w:r>
         <w:rPr>
           <w:rStyle w:val="lev"/>
           <w:b/>
           <w:bCs/>
         </w:rPr>
-        <w:t>distanciel</w:t>
-      </w:r>
-      <w:proofErr w:type="spellEnd"/>
+        <w:t>-auditifs</w:t>
+      </w:r>
+    </w:p>
+    <w:p>
+      <w:pPr>
+        <w:pStyle w:val="NormalWeb"/>
+        <w:numPr>
+          <w:ilvl w:val="0"/>
+          <w:numId w:val="7"/>
+        </w:numPr>
+      </w:pPr>
+      <w:r>
+        <w:rPr>
+          <w:rStyle w:val="font-ligatures-none"/>
+        </w:rPr>
+        <w:t>Contenus textuels simplifiés</w:t>
+      </w:r>
+    </w:p>
+    <w:p>
+      <w:pPr>
+        <w:pStyle w:val="NormalWeb"/>
+        <w:numPr>
+          <w:ilvl w:val="0"/>
+          <w:numId w:val="7"/>
+        </w:numPr>
+      </w:pPr>
+      <w:r>
+        <w:rPr>
+          <w:rStyle w:val="font-ligatures-none"/>
+        </w:rPr>
+        <w:t>Navigation visuelle intuitive</w:t>
+      </w:r>
+    </w:p>
+    <w:p>
+      <w:pPr>
+        <w:pStyle w:val="Titre3"/>
+      </w:pPr>
       <w:r>
         <w:rPr>
           <w:rStyle w:val="lev"/>
           <w:b/>
           <w:bCs/>
         </w:rPr>
-        <w:t xml:space="preserve"> (site web)</w:t>
-      </w:r>
-    </w:p>
-    <w:p>
-      <w:pPr>
-        <w:pStyle w:val="Titre3"/>
+        <w:t>4.4. Public général</w:t>
+      </w:r>
+    </w:p>
+    <w:p>
+      <w:pPr>
+        <w:pStyle w:val="NormalWeb"/>
+        <w:numPr>
+          <w:ilvl w:val="0"/>
+          <w:numId w:val="8"/>
+        </w:numPr>
+      </w:pPr>
+      <w:r>
+        <w:rPr>
+          <w:rStyle w:val="font-ligatures-none"/>
+        </w:rPr>
+        <w:t>Interface universelle, simple, inclusive</w:t>
+      </w:r>
+    </w:p>
+    <w:p>
+      <w:pPr>
+        <w:pStyle w:val="Titre2"/>
       </w:pPr>
       <w:r>
         <w:rPr>
@@ -573,91 +749,7 @@
           <w:b/>
           <w:bCs/>
         </w:rPr>
-        <w:t>Accessibilité numérique</w:t>
-      </w:r>
-    </w:p>
-    <w:p>
-      <w:pPr>
-        <w:pStyle w:val="NormalWeb"/>
-        <w:numPr>
-          <w:ilvl w:val="0"/>
-          <w:numId w:val="6"/>
-        </w:numPr>
-      </w:pPr>
-      <w:r>
-        <w:rPr>
-          <w:rStyle w:val="font-ligatures-none"/>
-        </w:rPr>
-        <w:lastRenderedPageBreak/>
-        <w:t>HTML sémantique + ARIA</w:t>
-      </w:r>
-    </w:p>
-    <w:p>
-      <w:pPr>
-        <w:pStyle w:val="NormalWeb"/>
-        <w:numPr>
-          <w:ilvl w:val="0"/>
-          <w:numId w:val="6"/>
-        </w:numPr>
-      </w:pPr>
-      <w:r>
-        <w:rPr>
-          <w:rStyle w:val="font-ligatures-none"/>
-        </w:rPr>
-        <w:t>Navigation 100 % clavier</w:t>
-      </w:r>
-    </w:p>
-    <w:p>
-      <w:pPr>
-        <w:pStyle w:val="NormalWeb"/>
-        <w:numPr>
-          <w:ilvl w:val="0"/>
-          <w:numId w:val="6"/>
-        </w:numPr>
-      </w:pPr>
-      <w:r>
-        <w:rPr>
-          <w:rStyle w:val="font-ligatures-none"/>
-        </w:rPr>
-        <w:t xml:space="preserve">Compatibilité NVDA, JAWS, </w:t>
-      </w:r>
-      <w:proofErr w:type="spellStart"/>
-      <w:r>
-        <w:rPr>
-          <w:rStyle w:val="font-ligatures-none"/>
-        </w:rPr>
-        <w:t>VoiceOver</w:t>
-      </w:r>
-      <w:proofErr w:type="spellEnd"/>
-    </w:p>
-    <w:p>
-      <w:pPr>
-        <w:pStyle w:val="NormalWeb"/>
-        <w:numPr>
-          <w:ilvl w:val="0"/>
-          <w:numId w:val="6"/>
-        </w:numPr>
-      </w:pPr>
-      <w:r>
-        <w:rPr>
-          <w:rStyle w:val="font-ligatures-none"/>
-        </w:rPr>
-        <w:t>Contrastes conformes RGAA</w:t>
-      </w:r>
-    </w:p>
-    <w:p>
-      <w:pPr>
-        <w:pStyle w:val="NormalWeb"/>
-        <w:numPr>
-          <w:ilvl w:val="0"/>
-          <w:numId w:val="6"/>
-        </w:numPr>
-      </w:pPr>
-      <w:r>
-        <w:rPr>
-          <w:rStyle w:val="font-ligatures-none"/>
-        </w:rPr>
-        <w:t>Mode texte large / mode simplifié</w:t>
+        <w:t>5. Fonctionnalités</w:t>
       </w:r>
     </w:p>
     <w:p>
@@ -670,332 +762,31 @@
           <w:b/>
           <w:bCs/>
         </w:rPr>
-        <w:t>Lecture des livres</w:t>
-      </w:r>
-    </w:p>
-    <w:p>
-      <w:pPr>
-        <w:pStyle w:val="NormalWeb"/>
-        <w:numPr>
-          <w:ilvl w:val="0"/>
-          <w:numId w:val="7"/>
-        </w:numPr>
-      </w:pPr>
-      <w:r>
-        <w:rPr>
-          <w:rStyle w:val="font-ligatures-none"/>
-        </w:rPr>
-        <w:t xml:space="preserve">Lecture </w:t>
-      </w:r>
-      <w:r>
-        <w:rPr>
-          <w:rStyle w:val="lev"/>
-        </w:rPr>
-        <w:t>texte accessible</w:t>
-      </w:r>
-      <w:r>
-        <w:rPr>
-          <w:rStyle w:val="font-ligatures-none"/>
-        </w:rPr>
-        <w:t xml:space="preserve"> (balises ARIA, structure logique)</w:t>
-      </w:r>
-    </w:p>
-    <w:p>
-      <w:pPr>
-        <w:pStyle w:val="NormalWeb"/>
-        <w:numPr>
-          <w:ilvl w:val="0"/>
-          <w:numId w:val="7"/>
-        </w:numPr>
-      </w:pPr>
-      <w:r>
-        <w:rPr>
-          <w:rStyle w:val="font-ligatures-none"/>
-        </w:rPr>
-        <w:t xml:space="preserve">Lecture </w:t>
-      </w:r>
-      <w:r>
-        <w:rPr>
-          <w:rStyle w:val="lev"/>
-        </w:rPr>
-        <w:t>audio</w:t>
-      </w:r>
-      <w:r>
-        <w:rPr>
-          <w:rStyle w:val="font-ligatures-none"/>
-        </w:rPr>
-        <w:t xml:space="preserve"> (TTS ou donneurs de voix)</w:t>
-      </w:r>
-    </w:p>
-    <w:p>
-      <w:pPr>
-        <w:pStyle w:val="NormalWeb"/>
-        <w:numPr>
-          <w:ilvl w:val="0"/>
-          <w:numId w:val="7"/>
-        </w:numPr>
-      </w:pPr>
-      <w:r>
-        <w:rPr>
-          <w:rStyle w:val="font-ligatures-none"/>
-        </w:rPr>
-        <w:t xml:space="preserve">Lecture </w:t>
-      </w:r>
-      <w:r>
-        <w:rPr>
-          <w:rStyle w:val="lev"/>
-        </w:rPr>
-        <w:t>braille numérique</w:t>
-      </w:r>
-      <w:r>
-        <w:rPr>
-          <w:rStyle w:val="font-ligatures-none"/>
-        </w:rPr>
-        <w:t xml:space="preserve"> via plage braille</w:t>
-      </w:r>
-    </w:p>
-    <w:p>
-      <w:pPr>
-        <w:pStyle w:val="NormalWeb"/>
-        <w:numPr>
-          <w:ilvl w:val="0"/>
-          <w:numId w:val="7"/>
-        </w:numPr>
-      </w:pPr>
-      <w:r>
-        <w:rPr>
-          <w:rStyle w:val="lev"/>
-        </w:rPr>
-        <w:t>Aucune possibilité de téléchargement</w:t>
-      </w:r>
-    </w:p>
-    <w:p>
-      <w:pPr>
-        <w:pStyle w:val="NormalWeb"/>
-        <w:numPr>
-          <w:ilvl w:val="0"/>
-          <w:numId w:val="7"/>
-        </w:numPr>
-      </w:pPr>
-      <w:r>
-        <w:rPr>
-          <w:rStyle w:val="lev"/>
-        </w:rPr>
-        <w:t>Blocage des captures d’écran</w:t>
-      </w:r>
-      <w:r>
-        <w:rPr>
-          <w:rStyle w:val="font-ligatures-none"/>
-        </w:rPr>
-        <w:t xml:space="preserve"> (</w:t>
+        <w:lastRenderedPageBreak/>
+        <w:t xml:space="preserve">5.1. Fonctionnalités en </w:t>
       </w:r>
       <w:proofErr w:type="spellStart"/>
-      <w:r>
-        <w:rPr>
-          <w:rStyle w:val="font-ligatures-none"/>
-        </w:rPr>
-        <w:t>watermark</w:t>
-      </w:r>
-      <w:proofErr w:type="spellEnd"/>
-      <w:r>
-        <w:rPr>
-          <w:rStyle w:val="font-ligatures-none"/>
-        </w:rPr>
-        <w:t xml:space="preserve"> dynamique, DRM web)</w:t>
-      </w:r>
-    </w:p>
-    <w:p>
-      <w:pPr>
-        <w:pStyle w:val="NormalWeb"/>
-        <w:numPr>
-          <w:ilvl w:val="0"/>
-          <w:numId w:val="7"/>
-        </w:numPr>
-      </w:pPr>
-      <w:r>
-        <w:rPr>
-          <w:rStyle w:val="lev"/>
-        </w:rPr>
-        <w:t>Streaming sécurisé</w:t>
-      </w:r>
-      <w:r>
-        <w:rPr>
-          <w:rStyle w:val="font-ligatures-none"/>
-        </w:rPr>
-        <w:t xml:space="preserve"> des contenus</w:t>
-      </w:r>
-    </w:p>
-    <w:p>
-      <w:pPr>
-        <w:pStyle w:val="Titre3"/>
-      </w:pPr>
       <w:r>
         <w:rPr>
           <w:rStyle w:val="lev"/>
           <w:b/>
           <w:bCs/>
         </w:rPr>
-        <w:t>Protection des auteurs</w:t>
-      </w:r>
-    </w:p>
-    <w:p>
-      <w:pPr>
-        <w:pStyle w:val="NormalWeb"/>
-        <w:numPr>
-          <w:ilvl w:val="0"/>
-          <w:numId w:val="8"/>
-        </w:numPr>
-      </w:pPr>
-      <w:r>
-        <w:rPr>
-          <w:rStyle w:val="font-ligatures-none"/>
-        </w:rPr>
-        <w:t>DRM anti</w:t>
-      </w:r>
-      <w:r>
-        <w:rPr>
-          <w:rStyle w:val="font-ligatures-none"/>
-        </w:rPr>
-        <w:noBreakHyphen/>
-        <w:t>copie</w:t>
-      </w:r>
-    </w:p>
-    <w:p>
-      <w:pPr>
-        <w:pStyle w:val="NormalWeb"/>
-        <w:numPr>
-          <w:ilvl w:val="0"/>
-          <w:numId w:val="8"/>
-        </w:numPr>
-      </w:pPr>
-      <w:r>
-        <w:rPr>
-          <w:rStyle w:val="font-ligatures-none"/>
-        </w:rPr>
-        <w:t>Désactivation du clic droit</w:t>
-      </w:r>
-    </w:p>
-    <w:p>
-      <w:pPr>
-        <w:pStyle w:val="NormalWeb"/>
-        <w:numPr>
-          <w:ilvl w:val="0"/>
-          <w:numId w:val="8"/>
-        </w:numPr>
-      </w:pPr>
-      <w:r>
-        <w:rPr>
-          <w:rStyle w:val="font-ligatures-none"/>
-        </w:rPr>
-        <w:t>Filigrane invisible sur les pages</w:t>
-      </w:r>
-    </w:p>
-    <w:p>
-      <w:pPr>
-        <w:pStyle w:val="NormalWeb"/>
-        <w:numPr>
-          <w:ilvl w:val="0"/>
-          <w:numId w:val="8"/>
-        </w:numPr>
-      </w:pPr>
-      <w:r>
-        <w:rPr>
-          <w:rStyle w:val="font-ligatures-none"/>
-        </w:rPr>
-        <w:t>Lecture uniquement en streaming</w:t>
-      </w:r>
-    </w:p>
-    <w:p>
-      <w:pPr>
-        <w:pStyle w:val="NormalWeb"/>
-        <w:numPr>
-          <w:ilvl w:val="0"/>
-          <w:numId w:val="8"/>
-        </w:numPr>
-      </w:pPr>
-      <w:r>
-        <w:rPr>
-          <w:rStyle w:val="font-ligatures-none"/>
-        </w:rPr>
-        <w:t>Aucune extraction possible du texte</w:t>
-      </w:r>
-    </w:p>
-    <w:p>
-      <w:pPr>
-        <w:pStyle w:val="Titre3"/>
-      </w:pPr>
+        <w:t>distanciel</w:t>
+      </w:r>
+      <w:proofErr w:type="spellEnd"/>
       <w:r>
         <w:rPr>
           <w:rStyle w:val="lev"/>
           <w:b/>
           <w:bCs/>
         </w:rPr>
-        <w:t>Fonctionnalités utilisateur</w:t>
-      </w:r>
-    </w:p>
-    <w:p>
-      <w:pPr>
-        <w:pStyle w:val="NormalWeb"/>
-        <w:numPr>
-          <w:ilvl w:val="0"/>
-          <w:numId w:val="9"/>
-        </w:numPr>
-      </w:pPr>
-      <w:r>
-        <w:rPr>
-          <w:rStyle w:val="font-ligatures-none"/>
-        </w:rPr>
-        <w:t>Favoris</w:t>
-      </w:r>
-    </w:p>
-    <w:p>
-      <w:pPr>
-        <w:pStyle w:val="NormalWeb"/>
-        <w:numPr>
-          <w:ilvl w:val="0"/>
-          <w:numId w:val="9"/>
-        </w:numPr>
-      </w:pPr>
-      <w:r>
-        <w:rPr>
-          <w:rStyle w:val="font-ligatures-none"/>
-        </w:rPr>
-        <w:t>Historique</w:t>
-      </w:r>
-    </w:p>
-    <w:p>
-      <w:pPr>
-        <w:pStyle w:val="NormalWeb"/>
-        <w:numPr>
-          <w:ilvl w:val="0"/>
-          <w:numId w:val="9"/>
-        </w:numPr>
-      </w:pPr>
-      <w:r>
-        <w:rPr>
-          <w:rStyle w:val="font-ligatures-none"/>
-        </w:rPr>
-        <w:t>Paramètres d’accessibilité</w:t>
-      </w:r>
-    </w:p>
-    <w:p>
-      <w:pPr>
-        <w:pStyle w:val="NormalWeb"/>
-        <w:numPr>
-          <w:ilvl w:val="0"/>
-          <w:numId w:val="9"/>
-        </w:numPr>
-      </w:pPr>
-      <w:r>
-        <w:rPr>
-          <w:rStyle w:val="font-ligatures-none"/>
-        </w:rPr>
-        <w:t>Profil utilisateur</w:t>
-      </w:r>
-    </w:p>
-    <w:p>
-      <w:pPr>
-        <w:pStyle w:val="Titre3"/>
+        <w:t xml:space="preserve"> (site web)</w:t>
+      </w:r>
+    </w:p>
+    <w:p>
+      <w:pPr>
+        <w:pStyle w:val="Titre4"/>
       </w:pPr>
       <w:r>
         <w:rPr>
@@ -1003,87 +794,95 @@
           <w:b/>
           <w:bCs/>
         </w:rPr>
-        <w:t>Fonctionnalités administrateur</w:t>
-      </w:r>
-    </w:p>
-    <w:p>
-      <w:pPr>
-        <w:pStyle w:val="NormalWeb"/>
-        <w:numPr>
-          <w:ilvl w:val="0"/>
-          <w:numId w:val="10"/>
-        </w:numPr>
-      </w:pPr>
-      <w:r>
-        <w:rPr>
-          <w:rStyle w:val="font-ligatures-none"/>
-        </w:rPr>
-        <w:t>Gestion des livres</w:t>
-      </w:r>
-    </w:p>
-    <w:p>
-      <w:pPr>
-        <w:pStyle w:val="NormalWeb"/>
-        <w:numPr>
-          <w:ilvl w:val="0"/>
-          <w:numId w:val="10"/>
-        </w:numPr>
-      </w:pPr>
-      <w:r>
-        <w:rPr>
-          <w:rStyle w:val="font-ligatures-none"/>
-        </w:rPr>
-        <w:t>Gestion des versions accessibles (audio, braille numérique, texte)</w:t>
-      </w:r>
-    </w:p>
-    <w:p>
-      <w:pPr>
-        <w:pStyle w:val="NormalWeb"/>
-        <w:numPr>
-          <w:ilvl w:val="0"/>
-          <w:numId w:val="10"/>
-        </w:numPr>
-      </w:pPr>
-      <w:r>
-        <w:rPr>
-          <w:rStyle w:val="font-ligatures-none"/>
-        </w:rPr>
-        <w:t>Gestion des utilisateurs</w:t>
-      </w:r>
-    </w:p>
-    <w:p>
-      <w:pPr>
-        <w:pStyle w:val="NormalWeb"/>
-        <w:numPr>
-          <w:ilvl w:val="0"/>
-          <w:numId w:val="10"/>
-        </w:numPr>
-      </w:pPr>
-      <w:r>
-        <w:rPr>
-          <w:rStyle w:val="font-ligatures-none"/>
-        </w:rPr>
-        <w:t>Suivi des consultations</w:t>
-      </w:r>
-    </w:p>
-    <w:p>
-      <w:pPr>
-        <w:pStyle w:val="NormalWeb"/>
-        <w:numPr>
-          <w:ilvl w:val="0"/>
-          <w:numId w:val="10"/>
-        </w:numPr>
-      </w:pPr>
-      <w:r>
-        <w:rPr>
-          <w:rStyle w:val="font-ligatures-none"/>
-        </w:rPr>
-        <w:t>Import sécurisé des œuvres</w:t>
-      </w:r>
-    </w:p>
-    <w:p>
-      <w:pPr>
-        <w:pStyle w:val="Titre2"/>
+        <w:t>Accessibilité numérique</w:t>
+      </w:r>
+    </w:p>
+    <w:p>
+      <w:pPr>
+        <w:pStyle w:val="NormalWeb"/>
+        <w:numPr>
+          <w:ilvl w:val="0"/>
+          <w:numId w:val="9"/>
+        </w:numPr>
+      </w:pPr>
+      <w:r>
+        <w:rPr>
+          <w:rStyle w:val="font-ligatures-none"/>
+        </w:rPr>
+        <w:t>HTML sémantique + ARIA</w:t>
+      </w:r>
+    </w:p>
+    <w:p>
+      <w:pPr>
+        <w:pStyle w:val="NormalWeb"/>
+        <w:numPr>
+          <w:ilvl w:val="0"/>
+          <w:numId w:val="9"/>
+        </w:numPr>
+      </w:pPr>
+      <w:r>
+        <w:rPr>
+          <w:rStyle w:val="font-ligatures-none"/>
+        </w:rPr>
+        <w:t>Navigation 100 % clavier</w:t>
+      </w:r>
+    </w:p>
+    <w:p>
+      <w:pPr>
+        <w:pStyle w:val="NormalWeb"/>
+        <w:numPr>
+          <w:ilvl w:val="0"/>
+          <w:numId w:val="9"/>
+        </w:numPr>
+      </w:pPr>
+      <w:r>
+        <w:rPr>
+          <w:rStyle w:val="font-ligatures-none"/>
+        </w:rPr>
+        <w:t xml:space="preserve">Compatibilité NVDA, JAWS, </w:t>
+      </w:r>
+      <w:proofErr w:type="spellStart"/>
+      <w:r>
+        <w:rPr>
+          <w:rStyle w:val="font-ligatures-none"/>
+        </w:rPr>
+        <w:t>VoiceOver</w:t>
+      </w:r>
+      <w:proofErr w:type="spellEnd"/>
+    </w:p>
+    <w:p>
+      <w:pPr>
+        <w:pStyle w:val="NormalWeb"/>
+        <w:numPr>
+          <w:ilvl w:val="0"/>
+          <w:numId w:val="9"/>
+        </w:numPr>
+      </w:pPr>
+      <w:r>
+        <w:rPr>
+          <w:rStyle w:val="font-ligatures-none"/>
+        </w:rPr>
+        <w:t>Contrastes conformes RGAA</w:t>
+      </w:r>
+    </w:p>
+    <w:p>
+      <w:pPr>
+        <w:pStyle w:val="NormalWeb"/>
+        <w:numPr>
+          <w:ilvl w:val="0"/>
+          <w:numId w:val="9"/>
+        </w:numPr>
+      </w:pPr>
+      <w:r>
+        <w:rPr>
+          <w:rStyle w:val="font-ligatures-none"/>
+        </w:rPr>
+        <w:t>Mode texte large / mode simplifié</w:t>
+      </w:r>
+    </w:p>
+    <w:p>
+      <w:pPr>
+        <w:pStyle w:val="Titre4"/>
       </w:pPr>
       <w:r>
         <w:rPr>
@@ -1091,12 +890,116 @@
           <w:b/>
           <w:bCs/>
         </w:rPr>
-        <w:t>3.2. Fonctionnalités en présentiel (bibliothèque physique)</w:t>
-      </w:r>
-    </w:p>
-    <w:p>
-      <w:pPr>
-        <w:pStyle w:val="Titre3"/>
+        <w:t>Lecture des livres</w:t>
+      </w:r>
+    </w:p>
+    <w:p>
+      <w:pPr>
+        <w:pStyle w:val="NormalWeb"/>
+        <w:numPr>
+          <w:ilvl w:val="0"/>
+          <w:numId w:val="10"/>
+        </w:numPr>
+      </w:pPr>
+      <w:r>
+        <w:rPr>
+          <w:rStyle w:val="font-ligatures-none"/>
+        </w:rPr>
+        <w:t>Lecture texte accessible</w:t>
+      </w:r>
+    </w:p>
+    <w:p>
+      <w:pPr>
+        <w:pStyle w:val="NormalWeb"/>
+        <w:numPr>
+          <w:ilvl w:val="0"/>
+          <w:numId w:val="10"/>
+        </w:numPr>
+      </w:pPr>
+      <w:r>
+        <w:rPr>
+          <w:rStyle w:val="font-ligatures-none"/>
+        </w:rPr>
+        <w:t>Lecture audio (TTS ou donneurs de voix)</w:t>
+      </w:r>
+    </w:p>
+    <w:p>
+      <w:pPr>
+        <w:pStyle w:val="NormalWeb"/>
+        <w:numPr>
+          <w:ilvl w:val="0"/>
+          <w:numId w:val="10"/>
+        </w:numPr>
+      </w:pPr>
+      <w:r>
+        <w:rPr>
+          <w:rStyle w:val="font-ligatures-none"/>
+        </w:rPr>
+        <w:t>Lecture braille numérique via plage braille</w:t>
+      </w:r>
+    </w:p>
+    <w:p>
+      <w:pPr>
+        <w:pStyle w:val="NormalWeb"/>
+        <w:numPr>
+          <w:ilvl w:val="0"/>
+          <w:numId w:val="10"/>
+        </w:numPr>
+      </w:pPr>
+      <w:r>
+        <w:rPr>
+          <w:rStyle w:val="font-ligatures-none"/>
+        </w:rPr>
+        <w:t>Aucune possibilité de téléchargement</w:t>
+      </w:r>
+    </w:p>
+    <w:p>
+      <w:pPr>
+        <w:pStyle w:val="NormalWeb"/>
+        <w:numPr>
+          <w:ilvl w:val="0"/>
+          <w:numId w:val="10"/>
+        </w:numPr>
+      </w:pPr>
+      <w:r>
+        <w:rPr>
+          <w:rStyle w:val="font-ligatures-none"/>
+        </w:rPr>
+        <w:t>Blocage des captures d’écran (</w:t>
+      </w:r>
+      <w:proofErr w:type="spellStart"/>
+      <w:r>
+        <w:rPr>
+          <w:rStyle w:val="font-ligatures-none"/>
+        </w:rPr>
+        <w:t>watermark</w:t>
+      </w:r>
+      <w:proofErr w:type="spellEnd"/>
+      <w:r>
+        <w:rPr>
+          <w:rStyle w:val="font-ligatures-none"/>
+        </w:rPr>
+        <w:t xml:space="preserve"> dynamique, DRM web)</w:t>
+      </w:r>
+    </w:p>
+    <w:p>
+      <w:pPr>
+        <w:pStyle w:val="NormalWeb"/>
+        <w:numPr>
+          <w:ilvl w:val="0"/>
+          <w:numId w:val="10"/>
+        </w:numPr>
+      </w:pPr>
+      <w:r>
+        <w:rPr>
+          <w:rStyle w:val="font-ligatures-none"/>
+        </w:rPr>
+        <w:t>Streaming sécurisé</w:t>
+      </w:r>
+    </w:p>
+    <w:p>
+      <w:pPr>
+        <w:pStyle w:val="Titre4"/>
       </w:pPr>
       <w:r>
         <w:rPr>
@@ -1104,7 +1007,7 @@
           <w:b/>
           <w:bCs/>
         </w:rPr>
-        <w:t>Accès braille</w:t>
+        <w:t>Protection des auteurs</w:t>
       </w:r>
     </w:p>
     <w:p>
@@ -1117,15 +1020,9 @@
       </w:pPr>
       <w:r>
         <w:rPr>
-          <w:rStyle w:val="lev"/>
-        </w:rPr>
-        <w:t>Plages braille disponibles</w:t>
-      </w:r>
-      <w:r>
-        <w:rPr>
-          <w:rStyle w:val="font-ligatures-none"/>
-        </w:rPr>
-        <w:t xml:space="preserve"> pour lire les livres numériques sur place</w:t>
+          <w:rStyle w:val="font-ligatures-none"/>
+        </w:rPr>
+        <w:t>DRM anti copie</w:t>
       </w:r>
     </w:p>
     <w:p>
@@ -1138,98 +1035,59 @@
       </w:pPr>
       <w:r>
         <w:rPr>
-          <w:rStyle w:val="lev"/>
-        </w:rPr>
-        <w:t>Impression braille papier</w:t>
-      </w:r>
-      <w:r>
-        <w:rPr>
-          <w:rStyle w:val="font-ligatures-none"/>
-        </w:rPr>
-        <w:t xml:space="preserve"> uniquement pour :</w:t>
-      </w:r>
-    </w:p>
-    <w:p>
-      <w:pPr>
-        <w:pStyle w:val="NormalWeb"/>
-        <w:numPr>
-          <w:ilvl w:val="1"/>
+          <w:rStyle w:val="font-ligatures-none"/>
+        </w:rPr>
+        <w:t>Désactivation du clic droit</w:t>
+      </w:r>
+    </w:p>
+    <w:p>
+      <w:pPr>
+        <w:pStyle w:val="NormalWeb"/>
+        <w:numPr>
+          <w:ilvl w:val="0"/>
           <w:numId w:val="11"/>
         </w:numPr>
       </w:pPr>
-      <w:proofErr w:type="gramStart"/>
-      <w:r>
-        <w:rPr>
-          <w:rStyle w:val="font-ligatures-none"/>
-        </w:rPr>
-        <w:t>résumés</w:t>
-      </w:r>
-      <w:proofErr w:type="gramEnd"/>
-    </w:p>
-    <w:p>
-      <w:pPr>
-        <w:pStyle w:val="NormalWeb"/>
-        <w:numPr>
-          <w:ilvl w:val="1"/>
+      <w:r>
+        <w:rPr>
+          <w:rStyle w:val="font-ligatures-none"/>
+        </w:rPr>
+        <w:t>Filigrane invisible</w:t>
+      </w:r>
+    </w:p>
+    <w:p>
+      <w:pPr>
+        <w:pStyle w:val="NormalWeb"/>
+        <w:numPr>
+          <w:ilvl w:val="0"/>
           <w:numId w:val="11"/>
         </w:numPr>
       </w:pPr>
-      <w:proofErr w:type="gramStart"/>
-      <w:r>
-        <w:rPr>
-          <w:rStyle w:val="font-ligatures-none"/>
-        </w:rPr>
-        <w:t>tables</w:t>
-      </w:r>
-      <w:proofErr w:type="gramEnd"/>
-      <w:r>
-        <w:rPr>
-          <w:rStyle w:val="font-ligatures-none"/>
-        </w:rPr>
-        <w:t xml:space="preserve"> des matières</w:t>
-      </w:r>
-    </w:p>
-    <w:p>
-      <w:pPr>
-        <w:pStyle w:val="NormalWeb"/>
-        <w:numPr>
-          <w:ilvl w:val="1"/>
+      <w:r>
+        <w:rPr>
+          <w:rStyle w:val="font-ligatures-none"/>
+        </w:rPr>
+        <w:t>Lecture uniquement en streaming</w:t>
+      </w:r>
+    </w:p>
+    <w:p>
+      <w:pPr>
+        <w:pStyle w:val="NormalWeb"/>
+        <w:numPr>
+          <w:ilvl w:val="0"/>
           <w:numId w:val="11"/>
         </w:numPr>
       </w:pPr>
-      <w:proofErr w:type="gramStart"/>
-      <w:r>
-        <w:rPr>
-          <w:rStyle w:val="font-ligatures-none"/>
-        </w:rPr>
-        <w:t>extraits</w:t>
-      </w:r>
-      <w:proofErr w:type="gramEnd"/>
-      <w:r>
-        <w:rPr>
-          <w:rStyle w:val="font-ligatures-none"/>
-        </w:rPr>
-        <w:t xml:space="preserve"> courts</w:t>
-      </w:r>
-    </w:p>
-    <w:p>
-      <w:pPr>
-        <w:pStyle w:val="NormalWeb"/>
-        <w:numPr>
-          <w:ilvl w:val="0"/>
-          <w:numId w:val="11"/>
-        </w:numPr>
-      </w:pPr>
-      <w:r>
-        <w:rPr>
-          <w:rStyle w:val="font-ligatures-none"/>
-        </w:rPr>
-        <w:t>Pas d’impression intégrale des livres (trop volumineux)</w:t>
-      </w:r>
-    </w:p>
-    <w:p>
-      <w:pPr>
-        <w:pStyle w:val="Titre3"/>
+      <w:r>
+        <w:rPr>
+          <w:rStyle w:val="font-ligatures-none"/>
+        </w:rPr>
+        <w:t>Aucune extraction possible du texte</w:t>
+      </w:r>
+    </w:p>
+    <w:p>
+      <w:pPr>
+        <w:pStyle w:val="Titre4"/>
       </w:pPr>
       <w:r>
         <w:rPr>
@@ -1237,8 +1095,7 @@
           <w:b/>
           <w:bCs/>
         </w:rPr>
-        <w:lastRenderedPageBreak/>
-        <w:t>Accès audio</w:t>
+        <w:t>Fonctionnalités utilisateur</w:t>
       </w:r>
     </w:p>
     <w:p>
@@ -1253,7 +1110,7 @@
         <w:rPr>
           <w:rStyle w:val="font-ligatures-none"/>
         </w:rPr>
-        <w:t>Cabines ou espaces dédiés à la lecture audio</w:t>
+        <w:t>Favoris</w:t>
       </w:r>
     </w:p>
     <w:p>
@@ -1268,13 +1125,7 @@
         <w:rPr>
           <w:rStyle w:val="font-ligatures-none"/>
         </w:rPr>
-        <w:t xml:space="preserve">Lectures réalisées par des </w:t>
-      </w:r>
-      <w:r>
-        <w:rPr>
-          <w:rStyle w:val="lev"/>
-        </w:rPr>
-        <w:t>donneurs de voix</w:t>
+        <w:t>Historique</w:t>
       </w:r>
     </w:p>
     <w:p>
@@ -1289,12 +1140,27 @@
         <w:rPr>
           <w:rStyle w:val="font-ligatures-none"/>
         </w:rPr>
-        <w:t>Casques adaptés pour les personnes ayant des troubles moteurs</w:t>
-      </w:r>
-    </w:p>
-    <w:p>
-      <w:pPr>
-        <w:pStyle w:val="Titre3"/>
+        <w:t>Paramètres d’accessibilité</w:t>
+      </w:r>
+    </w:p>
+    <w:p>
+      <w:pPr>
+        <w:pStyle w:val="NormalWeb"/>
+        <w:numPr>
+          <w:ilvl w:val="0"/>
+          <w:numId w:val="12"/>
+        </w:numPr>
+      </w:pPr>
+      <w:r>
+        <w:rPr>
+          <w:rStyle w:val="font-ligatures-none"/>
+        </w:rPr>
+        <w:t>Profil utilisateur</w:t>
+      </w:r>
+    </w:p>
+    <w:p>
+      <w:pPr>
+        <w:pStyle w:val="Titre4"/>
       </w:pPr>
       <w:r>
         <w:rPr>
@@ -1302,7 +1168,7 @@
           <w:b/>
           <w:bCs/>
         </w:rPr>
-        <w:t>Accessibilité physique</w:t>
+        <w:t>Fonctionnalités administrateur</w:t>
       </w:r>
     </w:p>
     <w:p>
@@ -1317,7 +1183,7 @@
         <w:rPr>
           <w:rStyle w:val="font-ligatures-none"/>
         </w:rPr>
-        <w:t>Mobilier adapté aux personnes ayant des difficultés à tenir un livre</w:t>
+        <w:t>Gestion des livres</w:t>
       </w:r>
     </w:p>
     <w:p>
@@ -1332,7 +1198,7 @@
         <w:rPr>
           <w:rStyle w:val="font-ligatures-none"/>
         </w:rPr>
-        <w:t>Tablettes fixées ou bras articulés pour lecture sans effort</w:t>
+        <w:t>Gestion des versions accessibles</w:t>
       </w:r>
     </w:p>
     <w:p>
@@ -1347,7 +1213,37 @@
         <w:rPr>
           <w:rStyle w:val="font-ligatures-none"/>
         </w:rPr>
-        <w:t>Parcours physique accessible (rampe, signalétique tactile)</w:t>
+        <w:t>Gestion des utilisateurs</w:t>
+      </w:r>
+    </w:p>
+    <w:p>
+      <w:pPr>
+        <w:pStyle w:val="NormalWeb"/>
+        <w:numPr>
+          <w:ilvl w:val="0"/>
+          <w:numId w:val="13"/>
+        </w:numPr>
+      </w:pPr>
+      <w:r>
+        <w:rPr>
+          <w:rStyle w:val="font-ligatures-none"/>
+        </w:rPr>
+        <w:t>Suivi des consultations</w:t>
+      </w:r>
+    </w:p>
+    <w:p>
+      <w:pPr>
+        <w:pStyle w:val="NormalWeb"/>
+        <w:numPr>
+          <w:ilvl w:val="0"/>
+          <w:numId w:val="13"/>
+        </w:numPr>
+      </w:pPr>
+      <w:r>
+        <w:rPr>
+          <w:rStyle w:val="font-ligatures-none"/>
+        </w:rPr>
+        <w:t>Import sécurisé des œuvres</w:t>
       </w:r>
     </w:p>
     <w:p>
@@ -1360,57 +1256,12 @@
           <w:b/>
           <w:bCs/>
         </w:rPr>
-        <w:t>Accessibilité pour déficients auditifs</w:t>
-      </w:r>
-    </w:p>
-    <w:p>
-      <w:pPr>
-        <w:pStyle w:val="NormalWeb"/>
-        <w:numPr>
-          <w:ilvl w:val="0"/>
-          <w:numId w:val="14"/>
-        </w:numPr>
-      </w:pPr>
-      <w:r>
-        <w:rPr>
-          <w:rStyle w:val="font-ligatures-none"/>
-        </w:rPr>
-        <w:t>Boucles magnétiques</w:t>
-      </w:r>
-    </w:p>
-    <w:p>
-      <w:pPr>
-        <w:pStyle w:val="NormalWeb"/>
-        <w:numPr>
-          <w:ilvl w:val="0"/>
-          <w:numId w:val="14"/>
-        </w:numPr>
-      </w:pPr>
-      <w:r>
-        <w:rPr>
-          <w:rStyle w:val="font-ligatures-none"/>
-        </w:rPr>
-        <w:t>Interface visuelle claire sur les bornes</w:t>
-      </w:r>
-    </w:p>
-    <w:p>
-      <w:pPr>
-        <w:pStyle w:val="NormalWeb"/>
-        <w:numPr>
-          <w:ilvl w:val="0"/>
-          <w:numId w:val="14"/>
-        </w:numPr>
-      </w:pPr>
-      <w:r>
-        <w:rPr>
-          <w:rStyle w:val="font-ligatures-none"/>
-        </w:rPr>
-        <w:t>Transcriptions textuelles disponibles</w:t>
-      </w:r>
-    </w:p>
-    <w:p>
-      <w:pPr>
-        <w:pStyle w:val="Titre1"/>
+        <w:t>5.2. Fonctionnalités en présentiel (bibliothèque physique)</w:t>
+      </w:r>
+    </w:p>
+    <w:p>
+      <w:pPr>
+        <w:pStyle w:val="Titre4"/>
       </w:pPr>
       <w:r>
         <w:rPr>
@@ -1418,12 +1269,57 @@
           <w:b/>
           <w:bCs/>
         </w:rPr>
-        <w:t>4. Contraintes techniques (version enrichie)</w:t>
-      </w:r>
-    </w:p>
-    <w:p>
-      <w:pPr>
-        <w:pStyle w:val="Titre3"/>
+        <w:t>Accès braille</w:t>
+      </w:r>
+    </w:p>
+    <w:p>
+      <w:pPr>
+        <w:pStyle w:val="NormalWeb"/>
+        <w:numPr>
+          <w:ilvl w:val="0"/>
+          <w:numId w:val="14"/>
+        </w:numPr>
+      </w:pPr>
+      <w:r>
+        <w:rPr>
+          <w:rStyle w:val="font-ligatures-none"/>
+        </w:rPr>
+        <w:t>Plages braille disponibles</w:t>
+      </w:r>
+    </w:p>
+    <w:p>
+      <w:pPr>
+        <w:pStyle w:val="NormalWeb"/>
+        <w:numPr>
+          <w:ilvl w:val="0"/>
+          <w:numId w:val="14"/>
+        </w:numPr>
+      </w:pPr>
+      <w:r>
+        <w:rPr>
+          <w:rStyle w:val="font-ligatures-none"/>
+        </w:rPr>
+        <w:t>Impression braille papier pour résumés, tables des matières, extraits courts</w:t>
+      </w:r>
+    </w:p>
+    <w:p>
+      <w:pPr>
+        <w:pStyle w:val="NormalWeb"/>
+        <w:numPr>
+          <w:ilvl w:val="0"/>
+          <w:numId w:val="14"/>
+        </w:numPr>
+      </w:pPr>
+      <w:r>
+        <w:rPr>
+          <w:rStyle w:val="font-ligatures-none"/>
+        </w:rPr>
+        <w:t>Pas d’impression intégrale des livres</w:t>
+      </w:r>
+    </w:p>
+    <w:p>
+      <w:pPr>
+        <w:pStyle w:val="Titre4"/>
       </w:pPr>
       <w:r>
         <w:rPr>
@@ -1431,7 +1327,8 @@
           <w:b/>
           <w:bCs/>
         </w:rPr>
-        <w:t>4.1. Accessibilité</w:t>
+        <w:lastRenderedPageBreak/>
+        <w:t>Accès audio</w:t>
       </w:r>
     </w:p>
     <w:p>
@@ -1446,7 +1343,7 @@
         <w:rPr>
           <w:rStyle w:val="font-ligatures-none"/>
         </w:rPr>
-        <w:t>Conformité RGAA 4.1</w:t>
+        <w:t>Cabines dédiées</w:t>
       </w:r>
     </w:p>
     <w:p>
@@ -1461,7 +1358,7 @@
         <w:rPr>
           <w:rStyle w:val="font-ligatures-none"/>
         </w:rPr>
-        <w:t>Compatibilité totale avec les lecteurs d’écran</w:t>
+        <w:t>Lectures réalisées par des donneurs de voix</w:t>
       </w:r>
     </w:p>
     <w:p>
@@ -1476,50 +1373,12 @@
         <w:rPr>
           <w:rStyle w:val="font-ligatures-none"/>
         </w:rPr>
-        <w:t>Interface linéaire, prévisible</w:t>
-      </w:r>
-    </w:p>
-    <w:p>
-      <w:pPr>
-        <w:pStyle w:val="NormalWeb"/>
-        <w:numPr>
-          <w:ilvl w:val="0"/>
-          <w:numId w:val="15"/>
-        </w:numPr>
-      </w:pPr>
-      <w:r>
-        <w:rPr>
-          <w:rStyle w:val="font-ligatures-none"/>
-        </w:rPr>
-        <w:t xml:space="preserve">Tests NVDA, JAWS, </w:t>
-      </w:r>
-      <w:proofErr w:type="spellStart"/>
-      <w:r>
-        <w:rPr>
-          <w:rStyle w:val="font-ligatures-none"/>
-        </w:rPr>
-        <w:t>VoiceOver</w:t>
-      </w:r>
-      <w:proofErr w:type="spellEnd"/>
-    </w:p>
-    <w:p>
-      <w:pPr>
-        <w:pStyle w:val="NormalWeb"/>
-        <w:numPr>
-          <w:ilvl w:val="0"/>
-          <w:numId w:val="15"/>
-        </w:numPr>
-      </w:pPr>
-      <w:r>
-        <w:rPr>
-          <w:rStyle w:val="font-ligatures-none"/>
-        </w:rPr>
-        <w:t>Tests utilisateurs déficients visuels (si possible)</w:t>
-      </w:r>
-    </w:p>
-    <w:p>
-      <w:pPr>
-        <w:pStyle w:val="Titre3"/>
+        <w:t>Casques adaptés</w:t>
+      </w:r>
+    </w:p>
+    <w:p>
+      <w:pPr>
+        <w:pStyle w:val="Titre4"/>
       </w:pPr>
       <w:r>
         <w:rPr>
@@ -1527,7 +1386,7 @@
           <w:b/>
           <w:bCs/>
         </w:rPr>
-        <w:t>4.2. Braille</w:t>
+        <w:t>Accessibilité physique</w:t>
       </w:r>
     </w:p>
     <w:p>
@@ -1542,7 +1401,7 @@
         <w:rPr>
           <w:rStyle w:val="font-ligatures-none"/>
         </w:rPr>
-        <w:t>Export automatique des résumés en braille (format BRF)</w:t>
+        <w:t>Mobilier adapté</w:t>
       </w:r>
     </w:p>
     <w:p>
@@ -1557,35 +1416,7 @@
         <w:rPr>
           <w:rStyle w:val="font-ligatures-none"/>
         </w:rPr>
-        <w:t>Compatibilité avec plages braille (</w:t>
-      </w:r>
-      <w:proofErr w:type="spellStart"/>
-      <w:r>
-        <w:rPr>
-          <w:rStyle w:val="font-ligatures-none"/>
-        </w:rPr>
-        <w:t>HumanWare</w:t>
-      </w:r>
-      <w:proofErr w:type="spellEnd"/>
-      <w:r>
-        <w:rPr>
-          <w:rStyle w:val="font-ligatures-none"/>
-        </w:rPr>
-        <w:t xml:space="preserve">, Focus, </w:t>
-      </w:r>
-      <w:proofErr w:type="spellStart"/>
-      <w:r>
-        <w:rPr>
-          <w:rStyle w:val="font-ligatures-none"/>
-        </w:rPr>
-        <w:t>Brailliant</w:t>
-      </w:r>
-      <w:proofErr w:type="spellEnd"/>
-      <w:r>
-        <w:rPr>
-          <w:rStyle w:val="font-ligatures-none"/>
-        </w:rPr>
-        <w:t>)</w:t>
+        <w:t>Tablettes fixées ou bras articulés</w:t>
       </w:r>
     </w:p>
     <w:p>
@@ -1600,12 +1431,12 @@
         <w:rPr>
           <w:rStyle w:val="font-ligatures-none"/>
         </w:rPr>
-        <w:t>Gestion des métadonnées braille (abréviations, pagination)</w:t>
-      </w:r>
-    </w:p>
-    <w:p>
-      <w:pPr>
-        <w:pStyle w:val="Titre3"/>
+        <w:t>Parcours accessible (rampe, signalétique tactile)</w:t>
+      </w:r>
+    </w:p>
+    <w:p>
+      <w:pPr>
+        <w:pStyle w:val="Titre4"/>
       </w:pPr>
       <w:r>
         <w:rPr>
@@ -1613,7 +1444,7 @@
           <w:b/>
           <w:bCs/>
         </w:rPr>
-        <w:t>4.3. Audio</w:t>
+        <w:t>Accessibilité pour déficients auditifs</w:t>
       </w:r>
     </w:p>
     <w:p>
@@ -1628,7 +1459,7 @@
         <w:rPr>
           <w:rStyle w:val="font-ligatures-none"/>
         </w:rPr>
-        <w:t>Lectures humaines (donneurs de voix)</w:t>
+        <w:t>Boucles magnétiques</w:t>
       </w:r>
     </w:p>
     <w:p>
@@ -1643,7 +1474,7 @@
         <w:rPr>
           <w:rStyle w:val="font-ligatures-none"/>
         </w:rPr>
-        <w:t>Lectures TTS (voix naturelles)</w:t>
+        <w:t>Interface visuelle claire</w:t>
       </w:r>
     </w:p>
     <w:p>
@@ -1658,12 +1489,12 @@
         <w:rPr>
           <w:rStyle w:val="font-ligatures-none"/>
         </w:rPr>
-        <w:t>Formats audio protégés (streaming uniquement)</w:t>
-      </w:r>
-    </w:p>
-    <w:p>
-      <w:pPr>
-        <w:pStyle w:val="Titre3"/>
+        <w:t>Transcriptions textuelles disponibles</w:t>
+      </w:r>
+    </w:p>
+    <w:p>
+      <w:pPr>
+        <w:pStyle w:val="Titre2"/>
       </w:pPr>
       <w:r>
         <w:rPr>
@@ -1671,137 +1502,12 @@
           <w:b/>
           <w:bCs/>
         </w:rPr>
-        <w:t>4.4. Sécurité et protection des œuvres</w:t>
-      </w:r>
-    </w:p>
-    <w:p>
-      <w:pPr>
-        <w:pStyle w:val="NormalWeb"/>
-        <w:numPr>
-          <w:ilvl w:val="0"/>
-          <w:numId w:val="18"/>
-        </w:numPr>
-      </w:pPr>
-      <w:r>
-        <w:rPr>
-          <w:rStyle w:val="font-ligatures-none"/>
-        </w:rPr>
-        <w:t>DRM web</w:t>
-      </w:r>
-    </w:p>
-    <w:p>
-      <w:pPr>
-        <w:pStyle w:val="NormalWeb"/>
-        <w:numPr>
-          <w:ilvl w:val="0"/>
-          <w:numId w:val="18"/>
-        </w:numPr>
-      </w:pPr>
-      <w:r>
-        <w:rPr>
-          <w:rStyle w:val="font-ligatures-none"/>
-        </w:rPr>
-        <w:t>Anti</w:t>
-      </w:r>
-      <w:r>
-        <w:rPr>
-          <w:rStyle w:val="font-ligatures-none"/>
-        </w:rPr>
-        <w:noBreakHyphen/>
-        <w:t xml:space="preserve">capture (CSS + </w:t>
-      </w:r>
-      <w:proofErr w:type="spellStart"/>
-      <w:r>
-        <w:rPr>
-          <w:rStyle w:val="font-ligatures-none"/>
-        </w:rPr>
-        <w:t>watermark</w:t>
-      </w:r>
-      <w:proofErr w:type="spellEnd"/>
-      <w:r>
-        <w:rPr>
-          <w:rStyle w:val="font-ligatures-none"/>
-        </w:rPr>
-        <w:t xml:space="preserve"> + script)</w:t>
-      </w:r>
-    </w:p>
-    <w:p>
-      <w:pPr>
-        <w:pStyle w:val="NormalWeb"/>
-        <w:numPr>
-          <w:ilvl w:val="0"/>
-          <w:numId w:val="18"/>
-        </w:numPr>
-      </w:pPr>
-      <w:r>
-        <w:rPr>
-          <w:rStyle w:val="font-ligatures-none"/>
-        </w:rPr>
-        <w:t>Anti</w:t>
-      </w:r>
-      <w:r>
-        <w:rPr>
-          <w:rStyle w:val="font-ligatures-none"/>
-        </w:rPr>
-        <w:noBreakHyphen/>
-        <w:t>téléchargement</w:t>
-      </w:r>
-    </w:p>
-    <w:p>
-      <w:pPr>
-        <w:pStyle w:val="NormalWeb"/>
-        <w:numPr>
-          <w:ilvl w:val="0"/>
-          <w:numId w:val="18"/>
-        </w:numPr>
-      </w:pPr>
-      <w:r>
-        <w:rPr>
-          <w:rStyle w:val="font-ligatures-none"/>
-        </w:rPr>
-        <w:t>Anti</w:t>
-      </w:r>
-      <w:r>
-        <w:rPr>
-          <w:rStyle w:val="font-ligatures-none"/>
-        </w:rPr>
-        <w:noBreakHyphen/>
-        <w:t>copie</w:t>
-      </w:r>
-    </w:p>
-    <w:p>
-      <w:pPr>
-        <w:pStyle w:val="NormalWeb"/>
-        <w:numPr>
-          <w:ilvl w:val="0"/>
-          <w:numId w:val="18"/>
-        </w:numPr>
-      </w:pPr>
-      <w:r>
-        <w:rPr>
-          <w:rStyle w:val="font-ligatures-none"/>
-        </w:rPr>
-        <w:t>Sessions temporaires</w:t>
-      </w:r>
-    </w:p>
-    <w:p>
-      <w:pPr>
-        <w:pStyle w:val="NormalWeb"/>
-        <w:numPr>
-          <w:ilvl w:val="0"/>
-          <w:numId w:val="18"/>
-        </w:numPr>
-      </w:pPr>
-      <w:r>
-        <w:rPr>
-          <w:rStyle w:val="font-ligatures-none"/>
-        </w:rPr>
-        <w:t>Chiffrement des flux audio et texte</w:t>
-      </w:r>
-    </w:p>
-    <w:p>
-      <w:pPr>
-        <w:pStyle w:val="Titre1"/>
+        <w:t>6. Contraintes techniques</w:t>
+      </w:r>
+    </w:p>
+    <w:p>
+      <w:pPr>
+        <w:pStyle w:val="Titre3"/>
       </w:pPr>
       <w:r>
         <w:rPr>
@@ -1809,8 +1515,90 @@
           <w:b/>
           <w:bCs/>
         </w:rPr>
-        <w:lastRenderedPageBreak/>
-        <w:t>5. Technologies</w:t>
+        <w:t>6.1. Accessibilité</w:t>
+      </w:r>
+    </w:p>
+    <w:p>
+      <w:pPr>
+        <w:pStyle w:val="NormalWeb"/>
+        <w:numPr>
+          <w:ilvl w:val="0"/>
+          <w:numId w:val="18"/>
+        </w:numPr>
+      </w:pPr>
+      <w:r>
+        <w:rPr>
+          <w:rStyle w:val="font-ligatures-none"/>
+        </w:rPr>
+        <w:t>Conformité RGAA 4.1</w:t>
+      </w:r>
+    </w:p>
+    <w:p>
+      <w:pPr>
+        <w:pStyle w:val="NormalWeb"/>
+        <w:numPr>
+          <w:ilvl w:val="0"/>
+          <w:numId w:val="18"/>
+        </w:numPr>
+      </w:pPr>
+      <w:r>
+        <w:rPr>
+          <w:rStyle w:val="font-ligatures-none"/>
+        </w:rPr>
+        <w:t>Compatibilité totale lecteurs d’écran</w:t>
+      </w:r>
+    </w:p>
+    <w:p>
+      <w:pPr>
+        <w:pStyle w:val="NormalWeb"/>
+        <w:numPr>
+          <w:ilvl w:val="0"/>
+          <w:numId w:val="18"/>
+        </w:numPr>
+      </w:pPr>
+      <w:r>
+        <w:rPr>
+          <w:rStyle w:val="font-ligatures-none"/>
+        </w:rPr>
+        <w:t>Interface linéaire et prévisible</w:t>
+      </w:r>
+    </w:p>
+    <w:p>
+      <w:pPr>
+        <w:pStyle w:val="NormalWeb"/>
+        <w:numPr>
+          <w:ilvl w:val="0"/>
+          <w:numId w:val="18"/>
+        </w:numPr>
+      </w:pPr>
+      <w:r>
+        <w:rPr>
+          <w:rStyle w:val="font-ligatures-none"/>
+        </w:rPr>
+        <w:t xml:space="preserve">Tests NVDA, JAWS, </w:t>
+      </w:r>
+      <w:proofErr w:type="spellStart"/>
+      <w:r>
+        <w:rPr>
+          <w:rStyle w:val="font-ligatures-none"/>
+        </w:rPr>
+        <w:t>VoiceOver</w:t>
+      </w:r>
+      <w:proofErr w:type="spellEnd"/>
+    </w:p>
+    <w:p>
+      <w:pPr>
+        <w:pStyle w:val="NormalWeb"/>
+        <w:numPr>
+          <w:ilvl w:val="0"/>
+          <w:numId w:val="18"/>
+        </w:numPr>
+      </w:pPr>
+      <w:r>
+        <w:rPr>
+          <w:rStyle w:val="font-ligatures-none"/>
+        </w:rPr>
+        <w:t>Tests utilisateurs (si possible)</w:t>
       </w:r>
     </w:p>
     <w:p>
@@ -1823,7 +1611,7 @@
           <w:b/>
           <w:bCs/>
         </w:rPr>
-        <w:t>Front</w:t>
+        <w:t>6.2. Braille</w:t>
       </w:r>
     </w:p>
     <w:p>
@@ -1838,16 +1626,51 @@
         <w:rPr>
           <w:rStyle w:val="font-ligatures-none"/>
         </w:rPr>
-        <w:t xml:space="preserve">HTML5, CSS3, </w:t>
+        <w:t>Export automatique des résumés en BRF</w:t>
+      </w:r>
+    </w:p>
+    <w:p>
+      <w:pPr>
+        <w:pStyle w:val="NormalWeb"/>
+        <w:numPr>
+          <w:ilvl w:val="0"/>
+          <w:numId w:val="19"/>
+        </w:numPr>
+      </w:pPr>
+      <w:r>
+        <w:rPr>
+          <w:rStyle w:val="font-ligatures-none"/>
+        </w:rPr>
+        <w:t>Compatibilité plages braille (</w:t>
       </w:r>
       <w:proofErr w:type="spellStart"/>
       <w:r>
         <w:rPr>
           <w:rStyle w:val="font-ligatures-none"/>
         </w:rPr>
-        <w:t>Bootstrap</w:t>
+        <w:t>HumanWare</w:t>
       </w:r>
       <w:proofErr w:type="spellEnd"/>
+      <w:r>
+        <w:rPr>
+          <w:rStyle w:val="font-ligatures-none"/>
+        </w:rPr>
+        <w:t xml:space="preserve">, Focus, </w:t>
+      </w:r>
+      <w:proofErr w:type="spellStart"/>
+      <w:r>
+        <w:rPr>
+          <w:rStyle w:val="font-ligatures-none"/>
+        </w:rPr>
+        <w:t>Brailliant</w:t>
+      </w:r>
+      <w:proofErr w:type="spellEnd"/>
+      <w:r>
+        <w:rPr>
+          <w:rStyle w:val="font-ligatures-none"/>
+        </w:rPr>
+        <w:t>)</w:t>
+      </w:r>
     </w:p>
     <w:p>
       <w:pPr>
@@ -1861,37 +1684,7 @@
         <w:rPr>
           <w:rStyle w:val="font-ligatures-none"/>
         </w:rPr>
-        <w:t>JavaScript</w:t>
-      </w:r>
-    </w:p>
-    <w:p>
-      <w:pPr>
-        <w:pStyle w:val="NormalWeb"/>
-        <w:numPr>
-          <w:ilvl w:val="0"/>
-          <w:numId w:val="19"/>
-        </w:numPr>
-      </w:pPr>
-      <w:r>
-        <w:rPr>
-          <w:rStyle w:val="font-ligatures-none"/>
-        </w:rPr>
-        <w:t>ARIA</w:t>
-      </w:r>
-    </w:p>
-    <w:p>
-      <w:pPr>
-        <w:pStyle w:val="NormalWeb"/>
-        <w:numPr>
-          <w:ilvl w:val="0"/>
-          <w:numId w:val="19"/>
-        </w:numPr>
-      </w:pPr>
-      <w:r>
-        <w:rPr>
-          <w:rStyle w:val="font-ligatures-none"/>
-        </w:rPr>
-        <w:t>RGAA</w:t>
+        <w:t>Gestion des métadonnées braille</w:t>
       </w:r>
     </w:p>
     <w:p>
@@ -1904,7 +1697,7 @@
           <w:b/>
           <w:bCs/>
         </w:rPr>
-        <w:t>Back</w:t>
+        <w:t>6.3. Audio</w:t>
       </w:r>
     </w:p>
     <w:p>
@@ -1915,33 +1708,11 @@
           <w:numId w:val="20"/>
         </w:numPr>
       </w:pPr>
-      <w:proofErr w:type="spellStart"/>
-      <w:r>
-        <w:rPr>
-          <w:rStyle w:val="font-ligatures-none"/>
-        </w:rPr>
-        <w:t>Symfony</w:t>
-      </w:r>
-      <w:proofErr w:type="spellEnd"/>
-      <w:r>
-        <w:rPr>
-          <w:rStyle w:val="font-ligatures-none"/>
-        </w:rPr>
-        <w:t xml:space="preserve"> / </w:t>
-      </w:r>
-      <w:proofErr w:type="spellStart"/>
-      <w:r>
-        <w:rPr>
-          <w:rStyle w:val="font-ligatures-none"/>
-        </w:rPr>
-        <w:t>Laravel</w:t>
-      </w:r>
-      <w:proofErr w:type="spellEnd"/>
-      <w:r>
-        <w:rPr>
-          <w:rStyle w:val="font-ligatures-none"/>
-        </w:rPr>
-        <w:t xml:space="preserve"> ou Node.js</w:t>
+      <w:r>
+        <w:rPr>
+          <w:rStyle w:val="font-ligatures-none"/>
+        </w:rPr>
+        <w:t>Lectures humaines</w:t>
       </w:r>
     </w:p>
     <w:p>
@@ -1956,7 +1727,7 @@
         <w:rPr>
           <w:rStyle w:val="font-ligatures-none"/>
         </w:rPr>
-        <w:t>API REST sécurisée</w:t>
+        <w:t>Lectures TTS</w:t>
       </w:r>
     </w:p>
     <w:p>
@@ -1971,7 +1742,7 @@
         <w:rPr>
           <w:rStyle w:val="font-ligatures-none"/>
         </w:rPr>
-        <w:t>Gestion des rôles</w:t>
+        <w:t>Formats audio protégés (streaming)</w:t>
       </w:r>
     </w:p>
     <w:p>
@@ -1984,7 +1755,7 @@
           <w:b/>
           <w:bCs/>
         </w:rPr>
-        <w:t>Base de données</w:t>
+        <w:t>6.4. Sécurité</w:t>
       </w:r>
     </w:p>
     <w:p>
@@ -1999,7 +1770,7 @@
         <w:rPr>
           <w:rStyle w:val="font-ligatures-none"/>
         </w:rPr>
-        <w:t>MySQL</w:t>
+        <w:t>DRM web</w:t>
       </w:r>
     </w:p>
     <w:p>
@@ -2014,215 +1785,86 @@
         <w:rPr>
           <w:rStyle w:val="font-ligatures-none"/>
         </w:rPr>
-        <w:t>Tables pour :</w:t>
-      </w:r>
-    </w:p>
-    <w:p>
-      <w:pPr>
-        <w:pStyle w:val="NormalWeb"/>
-        <w:numPr>
-          <w:ilvl w:val="1"/>
+        <w:t>Anti capture</w:t>
+      </w:r>
+    </w:p>
+    <w:p>
+      <w:pPr>
+        <w:pStyle w:val="NormalWeb"/>
+        <w:numPr>
+          <w:ilvl w:val="0"/>
           <w:numId w:val="21"/>
         </w:numPr>
       </w:pPr>
-      <w:proofErr w:type="gramStart"/>
-      <w:r>
-        <w:rPr>
-          <w:rStyle w:val="font-ligatures-none"/>
-        </w:rPr>
-        <w:t>livres</w:t>
-      </w:r>
-      <w:proofErr w:type="gramEnd"/>
-    </w:p>
-    <w:p>
-      <w:pPr>
-        <w:pStyle w:val="NormalWeb"/>
-        <w:numPr>
-          <w:ilvl w:val="1"/>
+      <w:r>
+        <w:rPr>
+          <w:rStyle w:val="font-ligatures-none"/>
+        </w:rPr>
+        <w:t>Anti téléchargement</w:t>
+      </w:r>
+    </w:p>
+    <w:p>
+      <w:pPr>
+        <w:pStyle w:val="NormalWeb"/>
+        <w:numPr>
+          <w:ilvl w:val="0"/>
           <w:numId w:val="21"/>
         </w:numPr>
       </w:pPr>
-      <w:proofErr w:type="gramStart"/>
-      <w:r>
-        <w:rPr>
-          <w:rStyle w:val="font-ligatures-none"/>
-        </w:rPr>
-        <w:t>versions</w:t>
-      </w:r>
-      <w:proofErr w:type="gramEnd"/>
-      <w:r>
-        <w:rPr>
-          <w:rStyle w:val="font-ligatures-none"/>
-        </w:rPr>
-        <w:t xml:space="preserve"> accessibles</w:t>
-      </w:r>
-    </w:p>
-    <w:p>
-      <w:pPr>
-        <w:pStyle w:val="NormalWeb"/>
-        <w:numPr>
-          <w:ilvl w:val="1"/>
+      <w:r>
+        <w:rPr>
+          <w:rStyle w:val="font-ligatures-none"/>
+        </w:rPr>
+        <w:t>Anti copie</w:t>
+      </w:r>
+    </w:p>
+    <w:p>
+      <w:pPr>
+        <w:pStyle w:val="NormalWeb"/>
+        <w:numPr>
+          <w:ilvl w:val="0"/>
           <w:numId w:val="21"/>
         </w:numPr>
       </w:pPr>
-      <w:proofErr w:type="gramStart"/>
-      <w:r>
-        <w:rPr>
-          <w:rStyle w:val="font-ligatures-none"/>
-        </w:rPr>
-        <w:t>audio</w:t>
-      </w:r>
-      <w:proofErr w:type="gramEnd"/>
-    </w:p>
-    <w:p>
-      <w:pPr>
-        <w:pStyle w:val="NormalWeb"/>
-        <w:numPr>
-          <w:ilvl w:val="1"/>
+      <w:r>
+        <w:rPr>
+          <w:rStyle w:val="font-ligatures-none"/>
+        </w:rPr>
+        <w:t>Sessions temporaires</w:t>
+      </w:r>
+    </w:p>
+    <w:p>
+      <w:pPr>
+        <w:pStyle w:val="NormalWeb"/>
+        <w:numPr>
+          <w:ilvl w:val="0"/>
           <w:numId w:val="21"/>
         </w:numPr>
       </w:pPr>
-      <w:proofErr w:type="gramStart"/>
-      <w:r>
-        <w:rPr>
-          <w:rStyle w:val="font-ligatures-none"/>
-        </w:rPr>
-        <w:t>braille</w:t>
-      </w:r>
-      <w:proofErr w:type="gramEnd"/>
-      <w:r>
-        <w:rPr>
-          <w:rStyle w:val="font-ligatures-none"/>
-        </w:rPr>
-        <w:t xml:space="preserve"> numérique</w:t>
-      </w:r>
-    </w:p>
-    <w:p>
-      <w:pPr>
-        <w:pStyle w:val="NormalWeb"/>
-        <w:numPr>
-          <w:ilvl w:val="1"/>
-          <w:numId w:val="21"/>
-        </w:numPr>
-      </w:pPr>
-      <w:proofErr w:type="gramStart"/>
-      <w:r>
-        <w:rPr>
-          <w:rStyle w:val="font-ligatures-none"/>
-        </w:rPr>
-        <w:t>utilisateurs</w:t>
-      </w:r>
-      <w:proofErr w:type="gramEnd"/>
-    </w:p>
-    <w:p>
-      <w:pPr>
-        <w:pStyle w:val="NormalWeb"/>
-        <w:numPr>
-          <w:ilvl w:val="1"/>
-          <w:numId w:val="21"/>
-        </w:numPr>
-      </w:pPr>
-      <w:proofErr w:type="gramStart"/>
-      <w:r>
-        <w:rPr>
-          <w:rStyle w:val="font-ligatures-none"/>
-        </w:rPr>
-        <w:t>historiques</w:t>
-      </w:r>
-      <w:proofErr w:type="gramEnd"/>
-    </w:p>
-    <w:p>
-      <w:pPr>
-        <w:pStyle w:val="Titre3"/>
-      </w:pPr>
-      <w:proofErr w:type="spellStart"/>
+      <w:r>
+        <w:rPr>
+          <w:rStyle w:val="font-ligatures-none"/>
+        </w:rPr>
+        <w:t>Chiffrement des flux</w:t>
+      </w:r>
+    </w:p>
+    <w:p>
+      <w:pPr>
+        <w:pStyle w:val="Titre2"/>
+      </w:pPr>
       <w:r>
         <w:rPr>
           <w:rStyle w:val="lev"/>
           <w:b/>
           <w:bCs/>
         </w:rPr>
-        <w:t>Présenciel</w:t>
-      </w:r>
-      <w:proofErr w:type="spellEnd"/>
-    </w:p>
-    <w:p>
-      <w:pPr>
-        <w:pStyle w:val="NormalWeb"/>
-        <w:numPr>
-          <w:ilvl w:val="0"/>
-          <w:numId w:val="22"/>
-        </w:numPr>
-      </w:pPr>
-      <w:r>
-        <w:rPr>
-          <w:rStyle w:val="font-ligatures-none"/>
-        </w:rPr>
-        <w:t xml:space="preserve">Plages braille (Focus, </w:t>
-      </w:r>
-      <w:proofErr w:type="spellStart"/>
-      <w:r>
-        <w:rPr>
-          <w:rStyle w:val="font-ligatures-none"/>
-        </w:rPr>
-        <w:t>Brailliant</w:t>
-      </w:r>
-      <w:proofErr w:type="spellEnd"/>
-      <w:r>
-        <w:rPr>
-          <w:rStyle w:val="font-ligatures-none"/>
-        </w:rPr>
-        <w:t>)</w:t>
-      </w:r>
-    </w:p>
-    <w:p>
-      <w:pPr>
-        <w:pStyle w:val="NormalWeb"/>
-        <w:numPr>
-          <w:ilvl w:val="0"/>
-          <w:numId w:val="22"/>
-        </w:numPr>
-      </w:pPr>
-      <w:r>
-        <w:rPr>
-          <w:rStyle w:val="font-ligatures-none"/>
-        </w:rPr>
-        <w:t>Imprimante braille (Index Everest, Juliet)</w:t>
-      </w:r>
-    </w:p>
-    <w:p>
-      <w:pPr>
-        <w:pStyle w:val="NormalWeb"/>
-        <w:numPr>
-          <w:ilvl w:val="0"/>
-          <w:numId w:val="22"/>
-        </w:numPr>
-      </w:pPr>
-      <w:r>
-        <w:rPr>
-          <w:rStyle w:val="font-ligatures-none"/>
-        </w:rPr>
-        <w:t>Casques audio</w:t>
-      </w:r>
-    </w:p>
-    <w:p>
-      <w:pPr>
-        <w:pStyle w:val="NormalWeb"/>
-        <w:numPr>
-          <w:ilvl w:val="0"/>
-          <w:numId w:val="22"/>
-        </w:numPr>
-      </w:pPr>
-      <w:r>
-        <w:rPr>
-          <w:rStyle w:val="font-ligatures-none"/>
-        </w:rPr>
-        <w:t>Bornes tactiles</w:t>
-      </w:r>
-    </w:p>
-    <w:p>
-      <w:pPr>
-        <w:pStyle w:val="Titre1"/>
+        <w:lastRenderedPageBreak/>
+        <w:t>7. Technologies</w:t>
+      </w:r>
+    </w:p>
+    <w:p>
+      <w:pPr>
+        <w:pStyle w:val="Titre3"/>
       </w:pPr>
       <w:r>
         <w:rPr>
@@ -2230,132 +1872,80 @@
           <w:b/>
           <w:bCs/>
         </w:rPr>
-        <w:t>6. Livrables</w:t>
-      </w:r>
-    </w:p>
-    <w:p>
-      <w:pPr>
-        <w:pStyle w:val="NormalWeb"/>
-        <w:numPr>
-          <w:ilvl w:val="0"/>
-          <w:numId w:val="23"/>
-        </w:numPr>
-      </w:pPr>
-      <w:r>
-        <w:rPr>
-          <w:rStyle w:val="font-ligatures-none"/>
-        </w:rPr>
-        <w:t>Cahier des charges complet</w:t>
-      </w:r>
-    </w:p>
-    <w:p>
-      <w:pPr>
-        <w:pStyle w:val="NormalWeb"/>
-        <w:numPr>
-          <w:ilvl w:val="0"/>
-          <w:numId w:val="23"/>
-        </w:numPr>
-      </w:pPr>
-      <w:r>
-        <w:rPr>
-          <w:rStyle w:val="font-ligatures-none"/>
-        </w:rPr>
-        <w:t>Diagrammes UML</w:t>
-      </w:r>
-    </w:p>
-    <w:p>
-      <w:pPr>
-        <w:pStyle w:val="NormalWeb"/>
-        <w:numPr>
-          <w:ilvl w:val="0"/>
-          <w:numId w:val="23"/>
-        </w:numPr>
-      </w:pPr>
-      <w:r>
-        <w:rPr>
-          <w:rStyle w:val="font-ligatures-none"/>
-        </w:rPr>
-        <w:t>Base de données</w:t>
-      </w:r>
-    </w:p>
-    <w:p>
-      <w:pPr>
-        <w:pStyle w:val="NormalWeb"/>
-        <w:numPr>
-          <w:ilvl w:val="0"/>
-          <w:numId w:val="23"/>
-        </w:numPr>
-      </w:pPr>
-      <w:r>
-        <w:rPr>
-          <w:rStyle w:val="font-ligatures-none"/>
-        </w:rPr>
-        <w:t>Prototype d’interface accessible</w:t>
-      </w:r>
-    </w:p>
-    <w:p>
-      <w:pPr>
-        <w:pStyle w:val="NormalWeb"/>
-        <w:numPr>
-          <w:ilvl w:val="0"/>
-          <w:numId w:val="23"/>
-        </w:numPr>
-      </w:pPr>
-      <w:r>
-        <w:rPr>
-          <w:rStyle w:val="font-ligatures-none"/>
-        </w:rPr>
-        <w:t>Documentation technique</w:t>
-      </w:r>
-    </w:p>
-    <w:p>
-      <w:pPr>
-        <w:pStyle w:val="NormalWeb"/>
-        <w:numPr>
-          <w:ilvl w:val="0"/>
-          <w:numId w:val="23"/>
-        </w:numPr>
-      </w:pPr>
-      <w:r>
-        <w:rPr>
-          <w:rStyle w:val="font-ligatures-none"/>
-        </w:rPr>
-        <w:t>Documentation utilisateur</w:t>
-      </w:r>
-    </w:p>
-    <w:p>
-      <w:pPr>
-        <w:pStyle w:val="NormalWeb"/>
-        <w:numPr>
-          <w:ilvl w:val="0"/>
-          <w:numId w:val="23"/>
-        </w:numPr>
-      </w:pPr>
-      <w:r>
-        <w:rPr>
-          <w:rStyle w:val="font-ligatures-none"/>
-        </w:rPr>
-        <w:t>Présentation finale (PowerPoint)</w:t>
-      </w:r>
-    </w:p>
-    <w:p>
-      <w:pPr>
-        <w:pStyle w:val="NormalWeb"/>
-        <w:numPr>
-          <w:ilvl w:val="0"/>
-          <w:numId w:val="23"/>
-        </w:numPr>
-      </w:pPr>
-      <w:r>
-        <w:rPr>
-          <w:rStyle w:val="font-ligatures-none"/>
-        </w:rPr>
-        <w:t>Pitch oral</w:t>
-      </w:r>
-    </w:p>
-    <w:p>
-      <w:pPr>
-        <w:pStyle w:val="Titre1"/>
+        <w:t>Front-end</w:t>
+      </w:r>
+    </w:p>
+    <w:p>
+      <w:pPr>
+        <w:pStyle w:val="NormalWeb"/>
+        <w:numPr>
+          <w:ilvl w:val="0"/>
+          <w:numId w:val="22"/>
+        </w:numPr>
+      </w:pPr>
+      <w:r>
+        <w:rPr>
+          <w:rStyle w:val="font-ligatures-none"/>
+        </w:rPr>
+        <w:t xml:space="preserve">HTML5, CSS3, </w:t>
+      </w:r>
+      <w:proofErr w:type="spellStart"/>
+      <w:r>
+        <w:rPr>
+          <w:rStyle w:val="font-ligatures-none"/>
+        </w:rPr>
+        <w:t>Bootstrap</w:t>
+      </w:r>
+      <w:proofErr w:type="spellEnd"/>
+    </w:p>
+    <w:p>
+      <w:pPr>
+        <w:pStyle w:val="NormalWeb"/>
+        <w:numPr>
+          <w:ilvl w:val="0"/>
+          <w:numId w:val="22"/>
+        </w:numPr>
+      </w:pPr>
+      <w:r>
+        <w:rPr>
+          <w:rStyle w:val="font-ligatures-none"/>
+        </w:rPr>
+        <w:t>JavaScript</w:t>
+      </w:r>
+    </w:p>
+    <w:p>
+      <w:pPr>
+        <w:pStyle w:val="NormalWeb"/>
+        <w:numPr>
+          <w:ilvl w:val="0"/>
+          <w:numId w:val="22"/>
+        </w:numPr>
+      </w:pPr>
+      <w:r>
+        <w:rPr>
+          <w:rStyle w:val="font-ligatures-none"/>
+        </w:rPr>
+        <w:t>ARIA</w:t>
+      </w:r>
+    </w:p>
+    <w:p>
+      <w:pPr>
+        <w:pStyle w:val="NormalWeb"/>
+        <w:numPr>
+          <w:ilvl w:val="0"/>
+          <w:numId w:val="22"/>
+        </w:numPr>
+      </w:pPr>
+      <w:r>
+        <w:rPr>
+          <w:rStyle w:val="font-ligatures-none"/>
+        </w:rPr>
+        <w:t>RGAA</w:t>
+      </w:r>
+    </w:p>
+    <w:p>
+      <w:pPr>
+        <w:pStyle w:val="Titre3"/>
       </w:pPr>
       <w:r>
         <w:rPr>
@@ -2363,7 +1953,87 @@
           <w:b/>
           <w:bCs/>
         </w:rPr>
-        <w:t>7. Planning (mis à jour)</w:t>
+        <w:t>Back-end</w:t>
+      </w:r>
+    </w:p>
+    <w:p>
+      <w:pPr>
+        <w:pStyle w:val="NormalWeb"/>
+        <w:numPr>
+          <w:ilvl w:val="0"/>
+          <w:numId w:val="23"/>
+        </w:numPr>
+      </w:pPr>
+      <w:proofErr w:type="spellStart"/>
+      <w:r>
+        <w:rPr>
+          <w:rStyle w:val="font-ligatures-none"/>
+        </w:rPr>
+        <w:t>Symfony</w:t>
+      </w:r>
+      <w:proofErr w:type="spellEnd"/>
+      <w:r>
+        <w:rPr>
+          <w:rStyle w:val="font-ligatures-none"/>
+        </w:rPr>
+        <w:t xml:space="preserve"> / </w:t>
+      </w:r>
+      <w:proofErr w:type="spellStart"/>
+      <w:r>
+        <w:rPr>
+          <w:rStyle w:val="font-ligatures-none"/>
+        </w:rPr>
+        <w:t>Laravel</w:t>
+      </w:r>
+      <w:proofErr w:type="spellEnd"/>
+      <w:r>
+        <w:rPr>
+          <w:rStyle w:val="font-ligatures-none"/>
+        </w:rPr>
+        <w:t xml:space="preserve"> ou Node.js</w:t>
+      </w:r>
+    </w:p>
+    <w:p>
+      <w:pPr>
+        <w:pStyle w:val="NormalWeb"/>
+        <w:numPr>
+          <w:ilvl w:val="0"/>
+          <w:numId w:val="23"/>
+        </w:numPr>
+      </w:pPr>
+      <w:r>
+        <w:rPr>
+          <w:rStyle w:val="font-ligatures-none"/>
+        </w:rPr>
+        <w:t>API REST sécurisée</w:t>
+      </w:r>
+    </w:p>
+    <w:p>
+      <w:pPr>
+        <w:pStyle w:val="NormalWeb"/>
+        <w:numPr>
+          <w:ilvl w:val="0"/>
+          <w:numId w:val="23"/>
+        </w:numPr>
+      </w:pPr>
+      <w:r>
+        <w:rPr>
+          <w:rStyle w:val="font-ligatures-none"/>
+        </w:rPr>
+        <w:t>Gestion des rôles</w:t>
+      </w:r>
+    </w:p>
+    <w:p>
+      <w:pPr>
+        <w:pStyle w:val="Titre3"/>
+      </w:pPr>
+      <w:r>
+        <w:rPr>
+          <w:rStyle w:val="lev"/>
+          <w:b/>
+          <w:bCs/>
+        </w:rPr>
+        <w:t>Base de données</w:t>
       </w:r>
     </w:p>
     <w:p>
@@ -2378,6 +2048,271 @@
         <w:rPr>
           <w:rStyle w:val="font-ligatures-none"/>
         </w:rPr>
+        <w:t>MySQL</w:t>
+      </w:r>
+    </w:p>
+    <w:p>
+      <w:pPr>
+        <w:pStyle w:val="NormalWeb"/>
+        <w:numPr>
+          <w:ilvl w:val="0"/>
+          <w:numId w:val="24"/>
+        </w:numPr>
+      </w:pPr>
+      <w:r>
+        <w:rPr>
+          <w:rStyle w:val="font-ligatures-none"/>
+        </w:rPr>
+        <w:t>Tables : livres, versions accessibles, audio, braille numérique, utilisateurs, historiques</w:t>
+      </w:r>
+    </w:p>
+    <w:p>
+      <w:pPr>
+        <w:pStyle w:val="Titre3"/>
+      </w:pPr>
+      <w:proofErr w:type="spellStart"/>
+      <w:r>
+        <w:rPr>
+          <w:rStyle w:val="lev"/>
+          <w:b/>
+          <w:bCs/>
+        </w:rPr>
+        <w:t>Présenciel</w:t>
+      </w:r>
+      <w:proofErr w:type="spellEnd"/>
+    </w:p>
+    <w:p>
+      <w:pPr>
+        <w:pStyle w:val="NormalWeb"/>
+        <w:numPr>
+          <w:ilvl w:val="0"/>
+          <w:numId w:val="25"/>
+        </w:numPr>
+      </w:pPr>
+      <w:r>
+        <w:rPr>
+          <w:rStyle w:val="font-ligatures-none"/>
+        </w:rPr>
+        <w:t xml:space="preserve">Plages braille (Focus, </w:t>
+      </w:r>
+      <w:proofErr w:type="spellStart"/>
+      <w:r>
+        <w:rPr>
+          <w:rStyle w:val="font-ligatures-none"/>
+        </w:rPr>
+        <w:t>Brailliant</w:t>
+      </w:r>
+      <w:proofErr w:type="spellEnd"/>
+      <w:r>
+        <w:rPr>
+          <w:rStyle w:val="font-ligatures-none"/>
+        </w:rPr>
+        <w:t>)</w:t>
+      </w:r>
+    </w:p>
+    <w:p>
+      <w:pPr>
+        <w:pStyle w:val="NormalWeb"/>
+        <w:numPr>
+          <w:ilvl w:val="0"/>
+          <w:numId w:val="25"/>
+        </w:numPr>
+      </w:pPr>
+      <w:r>
+        <w:rPr>
+          <w:rStyle w:val="font-ligatures-none"/>
+        </w:rPr>
+        <w:t>Imprimante braille (Index Everest, Juliet)</w:t>
+      </w:r>
+    </w:p>
+    <w:p>
+      <w:pPr>
+        <w:pStyle w:val="NormalWeb"/>
+        <w:numPr>
+          <w:ilvl w:val="0"/>
+          <w:numId w:val="25"/>
+        </w:numPr>
+      </w:pPr>
+      <w:r>
+        <w:rPr>
+          <w:rStyle w:val="font-ligatures-none"/>
+        </w:rPr>
+        <w:t>Casques audio</w:t>
+      </w:r>
+    </w:p>
+    <w:p>
+      <w:pPr>
+        <w:pStyle w:val="NormalWeb"/>
+        <w:numPr>
+          <w:ilvl w:val="0"/>
+          <w:numId w:val="25"/>
+        </w:numPr>
+      </w:pPr>
+      <w:r>
+        <w:rPr>
+          <w:rStyle w:val="font-ligatures-none"/>
+        </w:rPr>
+        <w:t>Bornes tactiles</w:t>
+      </w:r>
+    </w:p>
+    <w:p>
+      <w:pPr>
+        <w:pStyle w:val="Titre2"/>
+      </w:pPr>
+      <w:r>
+        <w:rPr>
+          <w:rStyle w:val="lev"/>
+          <w:b/>
+          <w:bCs/>
+        </w:rPr>
+        <w:t>8. Livrables</w:t>
+      </w:r>
+    </w:p>
+    <w:p>
+      <w:pPr>
+        <w:pStyle w:val="NormalWeb"/>
+        <w:numPr>
+          <w:ilvl w:val="0"/>
+          <w:numId w:val="26"/>
+        </w:numPr>
+      </w:pPr>
+      <w:r>
+        <w:rPr>
+          <w:rStyle w:val="font-ligatures-none"/>
+        </w:rPr>
+        <w:t>Cahier des charges complet</w:t>
+      </w:r>
+    </w:p>
+    <w:p>
+      <w:pPr>
+        <w:pStyle w:val="NormalWeb"/>
+        <w:numPr>
+          <w:ilvl w:val="0"/>
+          <w:numId w:val="26"/>
+        </w:numPr>
+      </w:pPr>
+      <w:r>
+        <w:rPr>
+          <w:rStyle w:val="font-ligatures-none"/>
+        </w:rPr>
+        <w:t>Diagrammes UML</w:t>
+      </w:r>
+    </w:p>
+    <w:p>
+      <w:pPr>
+        <w:pStyle w:val="NormalWeb"/>
+        <w:numPr>
+          <w:ilvl w:val="0"/>
+          <w:numId w:val="26"/>
+        </w:numPr>
+      </w:pPr>
+      <w:r>
+        <w:rPr>
+          <w:rStyle w:val="font-ligatures-none"/>
+        </w:rPr>
+        <w:t>Base de données</w:t>
+      </w:r>
+    </w:p>
+    <w:p>
+      <w:pPr>
+        <w:pStyle w:val="NormalWeb"/>
+        <w:numPr>
+          <w:ilvl w:val="0"/>
+          <w:numId w:val="26"/>
+        </w:numPr>
+      </w:pPr>
+      <w:r>
+        <w:rPr>
+          <w:rStyle w:val="font-ligatures-none"/>
+        </w:rPr>
+        <w:t>Prototype d’interface accessible</w:t>
+      </w:r>
+    </w:p>
+    <w:p>
+      <w:pPr>
+        <w:pStyle w:val="NormalWeb"/>
+        <w:numPr>
+          <w:ilvl w:val="0"/>
+          <w:numId w:val="26"/>
+        </w:numPr>
+      </w:pPr>
+      <w:r>
+        <w:rPr>
+          <w:rStyle w:val="font-ligatures-none"/>
+        </w:rPr>
+        <w:t>Documentation technique</w:t>
+      </w:r>
+    </w:p>
+    <w:p>
+      <w:pPr>
+        <w:pStyle w:val="NormalWeb"/>
+        <w:numPr>
+          <w:ilvl w:val="0"/>
+          <w:numId w:val="26"/>
+        </w:numPr>
+      </w:pPr>
+      <w:r>
+        <w:rPr>
+          <w:rStyle w:val="font-ligatures-none"/>
+        </w:rPr>
+        <w:t>Documentation utilisateur</w:t>
+      </w:r>
+    </w:p>
+    <w:p>
+      <w:pPr>
+        <w:pStyle w:val="NormalWeb"/>
+        <w:numPr>
+          <w:ilvl w:val="0"/>
+          <w:numId w:val="26"/>
+        </w:numPr>
+      </w:pPr>
+      <w:r>
+        <w:rPr>
+          <w:rStyle w:val="font-ligatures-none"/>
+        </w:rPr>
+        <w:t>Présentation finale</w:t>
+      </w:r>
+    </w:p>
+    <w:p>
+      <w:pPr>
+        <w:pStyle w:val="NormalWeb"/>
+        <w:numPr>
+          <w:ilvl w:val="0"/>
+          <w:numId w:val="26"/>
+        </w:numPr>
+      </w:pPr>
+      <w:r>
+        <w:rPr>
+          <w:rStyle w:val="font-ligatures-none"/>
+        </w:rPr>
+        <w:t>Pitch oral</w:t>
+      </w:r>
+    </w:p>
+    <w:p>
+      <w:pPr>
+        <w:pStyle w:val="Titre2"/>
+      </w:pPr>
+      <w:r>
+        <w:rPr>
+          <w:rStyle w:val="lev"/>
+          <w:b/>
+          <w:bCs/>
+        </w:rPr>
+        <w:t>9. Planning</w:t>
+      </w:r>
+    </w:p>
+    <w:p>
+      <w:pPr>
+        <w:pStyle w:val="NormalWeb"/>
+        <w:numPr>
+          <w:ilvl w:val="0"/>
+          <w:numId w:val="27"/>
+        </w:numPr>
+      </w:pPr>
+      <w:r>
+        <w:rPr>
+          <w:rStyle w:val="font-ligatures-none"/>
+        </w:rPr>
         <w:t>Semaine 1 : Analyse + cahier des charges</w:t>
       </w:r>
     </w:p>
@@ -2386,14 +2321,13 @@
         <w:pStyle w:val="NormalWeb"/>
         <w:numPr>
           <w:ilvl w:val="0"/>
-          <w:numId w:val="24"/>
-        </w:numPr>
-      </w:pPr>
-      <w:r>
-        <w:rPr>
-          <w:rStyle w:val="font-ligatures-none"/>
-        </w:rPr>
-        <w:lastRenderedPageBreak/>
+          <w:numId w:val="27"/>
+        </w:numPr>
+      </w:pPr>
+      <w:r>
+        <w:rPr>
+          <w:rStyle w:val="font-ligatures-none"/>
+        </w:rPr>
         <w:t>Semaine 2 : UML + architecture</w:t>
       </w:r>
     </w:p>
@@ -2402,7 +2336,7 @@
         <w:pStyle w:val="NormalWeb"/>
         <w:numPr>
           <w:ilvl w:val="0"/>
-          <w:numId w:val="24"/>
+          <w:numId w:val="27"/>
         </w:numPr>
       </w:pPr>
       <w:r>
@@ -2417,7 +2351,7 @@
         <w:pStyle w:val="NormalWeb"/>
         <w:numPr>
           <w:ilvl w:val="0"/>
-          <w:numId w:val="24"/>
+          <w:numId w:val="27"/>
         </w:numPr>
       </w:pPr>
       <w:r>
@@ -2432,7 +2366,7 @@
         <w:pStyle w:val="NormalWeb"/>
         <w:numPr>
           <w:ilvl w:val="0"/>
-          <w:numId w:val="24"/>
+          <w:numId w:val="27"/>
         </w:numPr>
       </w:pPr>
       <w:r>
@@ -2447,7 +2381,7 @@
         <w:pStyle w:val="NormalWeb"/>
         <w:numPr>
           <w:ilvl w:val="0"/>
-          <w:numId w:val="24"/>
+          <w:numId w:val="27"/>
         </w:numPr>
       </w:pPr>
       <w:r>
@@ -2462,29 +2396,22 @@
         <w:pStyle w:val="NormalWeb"/>
         <w:numPr>
           <w:ilvl w:val="0"/>
-          <w:numId w:val="24"/>
-        </w:numPr>
-      </w:pPr>
-      <w:r>
-        <w:rPr>
-          <w:rStyle w:val="font-ligatures-none"/>
-        </w:rPr>
-        <w:t>Semaine 7 : Sécurité anti</w:t>
-      </w:r>
-      <w:r>
-        <w:rPr>
-          <w:rStyle w:val="font-ligatures-none"/>
-        </w:rPr>
-        <w:noBreakHyphen/>
-        <w:t>piratage</w:t>
-      </w:r>
-    </w:p>
-    <w:p>
-      <w:pPr>
-        <w:pStyle w:val="NormalWeb"/>
-        <w:numPr>
-          <w:ilvl w:val="0"/>
-          <w:numId w:val="24"/>
+          <w:numId w:val="27"/>
+        </w:numPr>
+      </w:pPr>
+      <w:r>
+        <w:rPr>
+          <w:rStyle w:val="font-ligatures-none"/>
+        </w:rPr>
+        <w:t>Semaine 7 : Sécurité anti piratage</w:t>
+      </w:r>
+    </w:p>
+    <w:p>
+      <w:pPr>
+        <w:pStyle w:val="NormalWeb"/>
+        <w:numPr>
+          <w:ilvl w:val="0"/>
+          <w:numId w:val="27"/>
         </w:numPr>
       </w:pPr>
       <w:r>
@@ -2494,7 +2421,10 @@
         <w:t>Semaine 8 : Tests + soutenance</w:t>
       </w:r>
     </w:p>
-    <w:p/>
+    <w:p>
+      <w:bookmarkStart w:id="0" w:name="_GoBack"/>
+      <w:bookmarkEnd w:id="0"/>
+    </w:p>
     <w:sectPr>
       <w:pgSz w:w="11906" w:h="16838"/>
       <w:pgMar w:top="1417" w:right="1417" w:bottom="1417" w:left="1417" w:header="708" w:footer="708" w:gutter="0"/>
@@ -2508,9 +2438,9 @@
 <file path=word/numbering.xml><?xml version="1.0" encoding="utf-8"?>
 <w:numbering xmlns:wpc="http://schemas.microsoft.com/office/word/2010/wordprocessingCanvas" xmlns:cx="http://schemas.microsoft.com/office/drawing/2014/chartex" xmlns:cx1="http://schemas.microsoft.com/office/drawing/2015/9/8/chartex" xmlns:mc="http://schemas.openxmlformats.org/markup-compatibility/2006" xmlns:o="urn:schemas-microsoft-com:office:office" xmlns:r="http://schemas.openxmlformats.org/officeDocument/2006/relationships" xmlns:m="http://schemas.openxmlformats.org/officeDocument/2006/math" xmlns:v="urn:schemas-microsoft-com:vml" xmlns:wp14="http://schemas.microsoft.com/office/word/2010/wordprocessingDrawing" xmlns:wp="http://schemas.openxmlformats.org/drawingml/2006/wordprocessingDrawing" xmlns:w10="urn:schemas-microsoft-com:office:word" xmlns:w="http://schemas.openxmlformats.org/wordprocessingml/2006/main" xmlns:w14="http://schemas.microsoft.com/office/word/2010/wordml" xmlns:w15="http://schemas.microsoft.com/office/word/2012/wordml" xmlns:w16se="http://schemas.microsoft.com/office/word/2015/wordml/symex" xmlns:wpg="http://schemas.microsoft.com/office/word/2010/wordprocessingGroup" xmlns:wpi="http://schemas.microsoft.com/office/word/2010/wordprocessingInk" xmlns:wne="http://schemas.microsoft.com/office/word/2006/wordml" xmlns:wps="http://schemas.microsoft.com/office/word/2010/wordprocessingShape" mc:Ignorable="w14 w15 w16se wp14">
   <w:abstractNum w:abstractNumId="0" w15:restartNumberingAfterBreak="0">
-    <w:nsid w:val="056B18A3"/>
+    <w:nsid w:val="00921F5A"/>
     <w:multiLevelType w:val="multilevel"/>
-    <w:tmpl w:val="AB24FD9E"/>
+    <w:tmpl w:val="D28036D0"/>
     <w:lvl w:ilvl="0">
       <w:start w:val="1"/>
       <w:numFmt w:val="bullet"/>
@@ -2657,9 +2587,9 @@
     </w:lvl>
   </w:abstractNum>
   <w:abstractNum w:abstractNumId="1" w15:restartNumberingAfterBreak="0">
-    <w:nsid w:val="0AB8717D"/>
+    <w:nsid w:val="02DB302B"/>
     <w:multiLevelType w:val="multilevel"/>
-    <w:tmpl w:val="3258C0E6"/>
+    <w:tmpl w:val="5D9E13CE"/>
     <w:lvl w:ilvl="0">
       <w:start w:val="1"/>
       <w:numFmt w:val="bullet"/>
@@ -2806,9 +2736,9 @@
     </w:lvl>
   </w:abstractNum>
   <w:abstractNum w:abstractNumId="2" w15:restartNumberingAfterBreak="0">
-    <w:nsid w:val="0C97338F"/>
+    <w:nsid w:val="06547A82"/>
     <w:multiLevelType w:val="multilevel"/>
-    <w:tmpl w:val="6442B1B2"/>
+    <w:tmpl w:val="4D4025B6"/>
     <w:lvl w:ilvl="0">
       <w:start w:val="1"/>
       <w:numFmt w:val="bullet"/>
@@ -2955,9 +2885,9 @@
     </w:lvl>
   </w:abstractNum>
   <w:abstractNum w:abstractNumId="3" w15:restartNumberingAfterBreak="0">
-    <w:nsid w:val="1144088A"/>
+    <w:nsid w:val="08F00BA3"/>
     <w:multiLevelType w:val="multilevel"/>
-    <w:tmpl w:val="6D108B3A"/>
+    <w:tmpl w:val="4710BDD4"/>
     <w:lvl w:ilvl="0">
       <w:start w:val="1"/>
       <w:numFmt w:val="bullet"/>
@@ -3104,9 +3034,9 @@
     </w:lvl>
   </w:abstractNum>
   <w:abstractNum w:abstractNumId="4" w15:restartNumberingAfterBreak="0">
-    <w:nsid w:val="1211483C"/>
+    <w:nsid w:val="0DE23E4E"/>
     <w:multiLevelType w:val="multilevel"/>
-    <w:tmpl w:val="F1F02B7A"/>
+    <w:tmpl w:val="12DA9332"/>
     <w:lvl w:ilvl="0">
       <w:start w:val="1"/>
       <w:numFmt w:val="bullet"/>
@@ -3253,9 +3183,9 @@
     </w:lvl>
   </w:abstractNum>
   <w:abstractNum w:abstractNumId="5" w15:restartNumberingAfterBreak="0">
-    <w:nsid w:val="121D046C"/>
+    <w:nsid w:val="11FA5242"/>
     <w:multiLevelType w:val="multilevel"/>
-    <w:tmpl w:val="9830D90C"/>
+    <w:tmpl w:val="FAF2A35A"/>
     <w:lvl w:ilvl="0">
       <w:start w:val="1"/>
       <w:numFmt w:val="bullet"/>
@@ -3402,9 +3332,9 @@
     </w:lvl>
   </w:abstractNum>
   <w:abstractNum w:abstractNumId="6" w15:restartNumberingAfterBreak="0">
-    <w:nsid w:val="21487119"/>
+    <w:nsid w:val="198836AC"/>
     <w:multiLevelType w:val="multilevel"/>
-    <w:tmpl w:val="5BCE8868"/>
+    <w:tmpl w:val="29CE2784"/>
     <w:lvl w:ilvl="0">
       <w:start w:val="1"/>
       <w:numFmt w:val="bullet"/>
@@ -3551,9 +3481,9 @@
     </w:lvl>
   </w:abstractNum>
   <w:abstractNum w:abstractNumId="7" w15:restartNumberingAfterBreak="0">
-    <w:nsid w:val="218F1E14"/>
+    <w:nsid w:val="1D8F2A3F"/>
     <w:multiLevelType w:val="multilevel"/>
-    <w:tmpl w:val="491E95D6"/>
+    <w:tmpl w:val="DFE4E6B6"/>
     <w:lvl w:ilvl="0">
       <w:start w:val="1"/>
       <w:numFmt w:val="bullet"/>
@@ -3700,9 +3630,9 @@
     </w:lvl>
   </w:abstractNum>
   <w:abstractNum w:abstractNumId="8" w15:restartNumberingAfterBreak="0">
-    <w:nsid w:val="2E0B265A"/>
+    <w:nsid w:val="1F5F27FF"/>
     <w:multiLevelType w:val="multilevel"/>
-    <w:tmpl w:val="1A36DF74"/>
+    <w:tmpl w:val="4F06F4BA"/>
     <w:lvl w:ilvl="0">
       <w:start w:val="1"/>
       <w:numFmt w:val="bullet"/>
@@ -3849,9 +3779,9 @@
     </w:lvl>
   </w:abstractNum>
   <w:abstractNum w:abstractNumId="9" w15:restartNumberingAfterBreak="0">
-    <w:nsid w:val="2FD53FFC"/>
+    <w:nsid w:val="1F6341CA"/>
     <w:multiLevelType w:val="multilevel"/>
-    <w:tmpl w:val="E0BABD66"/>
+    <w:tmpl w:val="4C329722"/>
     <w:lvl w:ilvl="0">
       <w:start w:val="1"/>
       <w:numFmt w:val="bullet"/>
@@ -3868,7 +3798,7 @@
         <w:sz w:val="20"/>
       </w:rPr>
     </w:lvl>
-    <w:lvl w:ilvl="1">
+    <w:lvl w:ilvl="1" w:tentative="1">
       <w:start w:val="1"/>
       <w:numFmt w:val="bullet"/>
       <w:lvlText w:val="o"/>
@@ -3998,9 +3928,9 @@
     </w:lvl>
   </w:abstractNum>
   <w:abstractNum w:abstractNumId="10" w15:restartNumberingAfterBreak="0">
-    <w:nsid w:val="30CD54ED"/>
+    <w:nsid w:val="22375B25"/>
     <w:multiLevelType w:val="multilevel"/>
-    <w:tmpl w:val="B22CE1B6"/>
+    <w:tmpl w:val="CD328612"/>
     <w:lvl w:ilvl="0">
       <w:start w:val="1"/>
       <w:numFmt w:val="bullet"/>
@@ -4147,9 +4077,9 @@
     </w:lvl>
   </w:abstractNum>
   <w:abstractNum w:abstractNumId="11" w15:restartNumberingAfterBreak="0">
-    <w:nsid w:val="34C40BC6"/>
+    <w:nsid w:val="267B67FA"/>
     <w:multiLevelType w:val="multilevel"/>
-    <w:tmpl w:val="BEDC7C78"/>
+    <w:tmpl w:val="6B4A5B8C"/>
     <w:lvl w:ilvl="0">
       <w:start w:val="1"/>
       <w:numFmt w:val="bullet"/>
@@ -4296,9 +4226,9 @@
     </w:lvl>
   </w:abstractNum>
   <w:abstractNum w:abstractNumId="12" w15:restartNumberingAfterBreak="0">
-    <w:nsid w:val="3AC1497F"/>
+    <w:nsid w:val="2867261B"/>
     <w:multiLevelType w:val="multilevel"/>
-    <w:tmpl w:val="7F124122"/>
+    <w:tmpl w:val="2280F8AC"/>
     <w:lvl w:ilvl="0">
       <w:start w:val="1"/>
       <w:numFmt w:val="bullet"/>
@@ -4445,9 +4375,9 @@
     </w:lvl>
   </w:abstractNum>
   <w:abstractNum w:abstractNumId="13" w15:restartNumberingAfterBreak="0">
-    <w:nsid w:val="402456EE"/>
+    <w:nsid w:val="2B047412"/>
     <w:multiLevelType w:val="multilevel"/>
-    <w:tmpl w:val="3D041FF4"/>
+    <w:tmpl w:val="6ED8DECE"/>
     <w:lvl w:ilvl="0">
       <w:start w:val="1"/>
       <w:numFmt w:val="bullet"/>
@@ -4594,9 +4524,9 @@
     </w:lvl>
   </w:abstractNum>
   <w:abstractNum w:abstractNumId="14" w15:restartNumberingAfterBreak="0">
-    <w:nsid w:val="4A8A46C6"/>
+    <w:nsid w:val="316F33E6"/>
     <w:multiLevelType w:val="multilevel"/>
-    <w:tmpl w:val="9CEA5D7C"/>
+    <w:tmpl w:val="9CC6D3AE"/>
     <w:lvl w:ilvl="0">
       <w:start w:val="1"/>
       <w:numFmt w:val="bullet"/>
@@ -4743,9 +4673,9 @@
     </w:lvl>
   </w:abstractNum>
   <w:abstractNum w:abstractNumId="15" w15:restartNumberingAfterBreak="0">
-    <w:nsid w:val="4CDE32DC"/>
+    <w:nsid w:val="3C1A640C"/>
     <w:multiLevelType w:val="multilevel"/>
-    <w:tmpl w:val="9E92B75E"/>
+    <w:tmpl w:val="E8F6D006"/>
     <w:lvl w:ilvl="0">
       <w:start w:val="1"/>
       <w:numFmt w:val="bullet"/>
@@ -4892,9 +4822,9 @@
     </w:lvl>
   </w:abstractNum>
   <w:abstractNum w:abstractNumId="16" w15:restartNumberingAfterBreak="0">
-    <w:nsid w:val="4EBD7F4D"/>
+    <w:nsid w:val="3C53008B"/>
     <w:multiLevelType w:val="multilevel"/>
-    <w:tmpl w:val="E4C04E56"/>
+    <w:tmpl w:val="15D2830A"/>
     <w:lvl w:ilvl="0">
       <w:start w:val="1"/>
       <w:numFmt w:val="bullet"/>
@@ -4911,7 +4841,7 @@
         <w:sz w:val="20"/>
       </w:rPr>
     </w:lvl>
-    <w:lvl w:ilvl="1">
+    <w:lvl w:ilvl="1" w:tentative="1">
       <w:start w:val="1"/>
       <w:numFmt w:val="bullet"/>
       <w:lvlText w:val="o"/>
@@ -5041,9 +4971,9 @@
     </w:lvl>
   </w:abstractNum>
   <w:abstractNum w:abstractNumId="17" w15:restartNumberingAfterBreak="0">
-    <w:nsid w:val="55EF065D"/>
+    <w:nsid w:val="3EBD283E"/>
     <w:multiLevelType w:val="multilevel"/>
-    <w:tmpl w:val="8878C9C8"/>
+    <w:tmpl w:val="F8DA6D1A"/>
     <w:lvl w:ilvl="0">
       <w:start w:val="1"/>
       <w:numFmt w:val="bullet"/>
@@ -5190,9 +5120,9 @@
     </w:lvl>
   </w:abstractNum>
   <w:abstractNum w:abstractNumId="18" w15:restartNumberingAfterBreak="0">
-    <w:nsid w:val="5B2725B2"/>
+    <w:nsid w:val="3FE60DB0"/>
     <w:multiLevelType w:val="multilevel"/>
-    <w:tmpl w:val="BEE843EE"/>
+    <w:tmpl w:val="BA1A20F2"/>
     <w:lvl w:ilvl="0">
       <w:start w:val="1"/>
       <w:numFmt w:val="bullet"/>
@@ -5339,9 +5269,9 @@
     </w:lvl>
   </w:abstractNum>
   <w:abstractNum w:abstractNumId="19" w15:restartNumberingAfterBreak="0">
-    <w:nsid w:val="625B08C1"/>
+    <w:nsid w:val="4BE95E26"/>
     <w:multiLevelType w:val="multilevel"/>
-    <w:tmpl w:val="106A1BBC"/>
+    <w:tmpl w:val="3B2C7512"/>
     <w:lvl w:ilvl="0">
       <w:start w:val="1"/>
       <w:numFmt w:val="bullet"/>
@@ -5488,9 +5418,9 @@
     </w:lvl>
   </w:abstractNum>
   <w:abstractNum w:abstractNumId="20" w15:restartNumberingAfterBreak="0">
-    <w:nsid w:val="63DA6D9F"/>
+    <w:nsid w:val="506D1EB8"/>
     <w:multiLevelType w:val="multilevel"/>
-    <w:tmpl w:val="7D466CB6"/>
+    <w:tmpl w:val="3CEC807A"/>
     <w:lvl w:ilvl="0">
       <w:start w:val="1"/>
       <w:numFmt w:val="bullet"/>
@@ -5637,9 +5567,9 @@
     </w:lvl>
   </w:abstractNum>
   <w:abstractNum w:abstractNumId="21" w15:restartNumberingAfterBreak="0">
-    <w:nsid w:val="71853F0F"/>
+    <w:nsid w:val="5957360F"/>
     <w:multiLevelType w:val="multilevel"/>
-    <w:tmpl w:val="D5A0DE70"/>
+    <w:tmpl w:val="5152439C"/>
     <w:lvl w:ilvl="0">
       <w:start w:val="1"/>
       <w:numFmt w:val="bullet"/>
@@ -5786,9 +5716,9 @@
     </w:lvl>
   </w:abstractNum>
   <w:abstractNum w:abstractNumId="22" w15:restartNumberingAfterBreak="0">
-    <w:nsid w:val="783318D3"/>
+    <w:nsid w:val="683347D1"/>
     <w:multiLevelType w:val="multilevel"/>
-    <w:tmpl w:val="F82C3A2E"/>
+    <w:tmpl w:val="AE6CD226"/>
     <w:lvl w:ilvl="0">
       <w:start w:val="1"/>
       <w:numFmt w:val="bullet"/>
@@ -5935,9 +5865,456 @@
     </w:lvl>
   </w:abstractNum>
   <w:abstractNum w:abstractNumId="23" w15:restartNumberingAfterBreak="0">
-    <w:nsid w:val="7E567FDD"/>
+    <w:nsid w:val="6C147D69"/>
     <w:multiLevelType w:val="multilevel"/>
-    <w:tmpl w:val="1C0C6416"/>
+    <w:tmpl w:val="EDA45742"/>
+    <w:lvl w:ilvl="0">
+      <w:start w:val="1"/>
+      <w:numFmt w:val="bullet"/>
+      <w:lvlText w:val=""/>
+      <w:lvlJc w:val="left"/>
+      <w:pPr>
+        <w:tabs>
+          <w:tab w:val="num" w:pos="720"/>
+        </w:tabs>
+        <w:ind w:left="720" w:hanging="360"/>
+      </w:pPr>
+      <w:rPr>
+        <w:rFonts w:ascii="Symbol" w:hAnsi="Symbol" w:hint="default"/>
+        <w:sz w:val="20"/>
+      </w:rPr>
+    </w:lvl>
+    <w:lvl w:ilvl="1" w:tentative="1">
+      <w:start w:val="1"/>
+      <w:numFmt w:val="bullet"/>
+      <w:lvlText w:val="o"/>
+      <w:lvlJc w:val="left"/>
+      <w:pPr>
+        <w:tabs>
+          <w:tab w:val="num" w:pos="1440"/>
+        </w:tabs>
+        <w:ind w:left="1440" w:hanging="360"/>
+      </w:pPr>
+      <w:rPr>
+        <w:rFonts w:ascii="Courier New" w:hAnsi="Courier New" w:hint="default"/>
+        <w:sz w:val="20"/>
+      </w:rPr>
+    </w:lvl>
+    <w:lvl w:ilvl="2" w:tentative="1">
+      <w:start w:val="1"/>
+      <w:numFmt w:val="bullet"/>
+      <w:lvlText w:val=""/>
+      <w:lvlJc w:val="left"/>
+      <w:pPr>
+        <w:tabs>
+          <w:tab w:val="num" w:pos="2160"/>
+        </w:tabs>
+        <w:ind w:left="2160" w:hanging="360"/>
+      </w:pPr>
+      <w:rPr>
+        <w:rFonts w:ascii="Wingdings" w:hAnsi="Wingdings" w:hint="default"/>
+        <w:sz w:val="20"/>
+      </w:rPr>
+    </w:lvl>
+    <w:lvl w:ilvl="3" w:tentative="1">
+      <w:start w:val="1"/>
+      <w:numFmt w:val="bullet"/>
+      <w:lvlText w:val=""/>
+      <w:lvlJc w:val="left"/>
+      <w:pPr>
+        <w:tabs>
+          <w:tab w:val="num" w:pos="2880"/>
+        </w:tabs>
+        <w:ind w:left="2880" w:hanging="360"/>
+      </w:pPr>
+      <w:rPr>
+        <w:rFonts w:ascii="Wingdings" w:hAnsi="Wingdings" w:hint="default"/>
+        <w:sz w:val="20"/>
+      </w:rPr>
+    </w:lvl>
+    <w:lvl w:ilvl="4" w:tentative="1">
+      <w:start w:val="1"/>
+      <w:numFmt w:val="bullet"/>
+      <w:lvlText w:val=""/>
+      <w:lvlJc w:val="left"/>
+      <w:pPr>
+        <w:tabs>
+          <w:tab w:val="num" w:pos="3600"/>
+        </w:tabs>
+        <w:ind w:left="3600" w:hanging="360"/>
+      </w:pPr>
+      <w:rPr>
+        <w:rFonts w:ascii="Wingdings" w:hAnsi="Wingdings" w:hint="default"/>
+        <w:sz w:val="20"/>
+      </w:rPr>
+    </w:lvl>
+    <w:lvl w:ilvl="5" w:tentative="1">
+      <w:start w:val="1"/>
+      <w:numFmt w:val="bullet"/>
+      <w:lvlText w:val=""/>
+      <w:lvlJc w:val="left"/>
+      <w:pPr>
+        <w:tabs>
+          <w:tab w:val="num" w:pos="4320"/>
+        </w:tabs>
+        <w:ind w:left="4320" w:hanging="360"/>
+      </w:pPr>
+      <w:rPr>
+        <w:rFonts w:ascii="Wingdings" w:hAnsi="Wingdings" w:hint="default"/>
+        <w:sz w:val="20"/>
+      </w:rPr>
+    </w:lvl>
+    <w:lvl w:ilvl="6" w:tentative="1">
+      <w:start w:val="1"/>
+      <w:numFmt w:val="bullet"/>
+      <w:lvlText w:val=""/>
+      <w:lvlJc w:val="left"/>
+      <w:pPr>
+        <w:tabs>
+          <w:tab w:val="num" w:pos="5040"/>
+        </w:tabs>
+        <w:ind w:left="5040" w:hanging="360"/>
+      </w:pPr>
+      <w:rPr>
+        <w:rFonts w:ascii="Wingdings" w:hAnsi="Wingdings" w:hint="default"/>
+        <w:sz w:val="20"/>
+      </w:rPr>
+    </w:lvl>
+    <w:lvl w:ilvl="7" w:tentative="1">
+      <w:start w:val="1"/>
+      <w:numFmt w:val="bullet"/>
+      <w:lvlText w:val=""/>
+      <w:lvlJc w:val="left"/>
+      <w:pPr>
+        <w:tabs>
+          <w:tab w:val="num" w:pos="5760"/>
+        </w:tabs>
+        <w:ind w:left="5760" w:hanging="360"/>
+      </w:pPr>
+      <w:rPr>
+        <w:rFonts w:ascii="Wingdings" w:hAnsi="Wingdings" w:hint="default"/>
+        <w:sz w:val="20"/>
+      </w:rPr>
+    </w:lvl>
+    <w:lvl w:ilvl="8" w:tentative="1">
+      <w:start w:val="1"/>
+      <w:numFmt w:val="bullet"/>
+      <w:lvlText w:val=""/>
+      <w:lvlJc w:val="left"/>
+      <w:pPr>
+        <w:tabs>
+          <w:tab w:val="num" w:pos="6480"/>
+        </w:tabs>
+        <w:ind w:left="6480" w:hanging="360"/>
+      </w:pPr>
+      <w:rPr>
+        <w:rFonts w:ascii="Wingdings" w:hAnsi="Wingdings" w:hint="default"/>
+        <w:sz w:val="20"/>
+      </w:rPr>
+    </w:lvl>
+  </w:abstractNum>
+  <w:abstractNum w:abstractNumId="24" w15:restartNumberingAfterBreak="0">
+    <w:nsid w:val="6E601903"/>
+    <w:multiLevelType w:val="multilevel"/>
+    <w:tmpl w:val="8162ED90"/>
+    <w:lvl w:ilvl="0">
+      <w:start w:val="1"/>
+      <w:numFmt w:val="bullet"/>
+      <w:lvlText w:val=""/>
+      <w:lvlJc w:val="left"/>
+      <w:pPr>
+        <w:tabs>
+          <w:tab w:val="num" w:pos="720"/>
+        </w:tabs>
+        <w:ind w:left="720" w:hanging="360"/>
+      </w:pPr>
+      <w:rPr>
+        <w:rFonts w:ascii="Symbol" w:hAnsi="Symbol" w:hint="default"/>
+        <w:sz w:val="20"/>
+      </w:rPr>
+    </w:lvl>
+    <w:lvl w:ilvl="1" w:tentative="1">
+      <w:start w:val="1"/>
+      <w:numFmt w:val="bullet"/>
+      <w:lvlText w:val="o"/>
+      <w:lvlJc w:val="left"/>
+      <w:pPr>
+        <w:tabs>
+          <w:tab w:val="num" w:pos="1440"/>
+        </w:tabs>
+        <w:ind w:left="1440" w:hanging="360"/>
+      </w:pPr>
+      <w:rPr>
+        <w:rFonts w:ascii="Courier New" w:hAnsi="Courier New" w:hint="default"/>
+        <w:sz w:val="20"/>
+      </w:rPr>
+    </w:lvl>
+    <w:lvl w:ilvl="2" w:tentative="1">
+      <w:start w:val="1"/>
+      <w:numFmt w:val="bullet"/>
+      <w:lvlText w:val=""/>
+      <w:lvlJc w:val="left"/>
+      <w:pPr>
+        <w:tabs>
+          <w:tab w:val="num" w:pos="2160"/>
+        </w:tabs>
+        <w:ind w:left="2160" w:hanging="360"/>
+      </w:pPr>
+      <w:rPr>
+        <w:rFonts w:ascii="Wingdings" w:hAnsi="Wingdings" w:hint="default"/>
+        <w:sz w:val="20"/>
+      </w:rPr>
+    </w:lvl>
+    <w:lvl w:ilvl="3" w:tentative="1">
+      <w:start w:val="1"/>
+      <w:numFmt w:val="bullet"/>
+      <w:lvlText w:val=""/>
+      <w:lvlJc w:val="left"/>
+      <w:pPr>
+        <w:tabs>
+          <w:tab w:val="num" w:pos="2880"/>
+        </w:tabs>
+        <w:ind w:left="2880" w:hanging="360"/>
+      </w:pPr>
+      <w:rPr>
+        <w:rFonts w:ascii="Wingdings" w:hAnsi="Wingdings" w:hint="default"/>
+        <w:sz w:val="20"/>
+      </w:rPr>
+    </w:lvl>
+    <w:lvl w:ilvl="4" w:tentative="1">
+      <w:start w:val="1"/>
+      <w:numFmt w:val="bullet"/>
+      <w:lvlText w:val=""/>
+      <w:lvlJc w:val="left"/>
+      <w:pPr>
+        <w:tabs>
+          <w:tab w:val="num" w:pos="3600"/>
+        </w:tabs>
+        <w:ind w:left="3600" w:hanging="360"/>
+      </w:pPr>
+      <w:rPr>
+        <w:rFonts w:ascii="Wingdings" w:hAnsi="Wingdings" w:hint="default"/>
+        <w:sz w:val="20"/>
+      </w:rPr>
+    </w:lvl>
+    <w:lvl w:ilvl="5" w:tentative="1">
+      <w:start w:val="1"/>
+      <w:numFmt w:val="bullet"/>
+      <w:lvlText w:val=""/>
+      <w:lvlJc w:val="left"/>
+      <w:pPr>
+        <w:tabs>
+          <w:tab w:val="num" w:pos="4320"/>
+        </w:tabs>
+        <w:ind w:left="4320" w:hanging="360"/>
+      </w:pPr>
+      <w:rPr>
+        <w:rFonts w:ascii="Wingdings" w:hAnsi="Wingdings" w:hint="default"/>
+        <w:sz w:val="20"/>
+      </w:rPr>
+    </w:lvl>
+    <w:lvl w:ilvl="6" w:tentative="1">
+      <w:start w:val="1"/>
+      <w:numFmt w:val="bullet"/>
+      <w:lvlText w:val=""/>
+      <w:lvlJc w:val="left"/>
+      <w:pPr>
+        <w:tabs>
+          <w:tab w:val="num" w:pos="5040"/>
+        </w:tabs>
+        <w:ind w:left="5040" w:hanging="360"/>
+      </w:pPr>
+      <w:rPr>
+        <w:rFonts w:ascii="Wingdings" w:hAnsi="Wingdings" w:hint="default"/>
+        <w:sz w:val="20"/>
+      </w:rPr>
+    </w:lvl>
+    <w:lvl w:ilvl="7" w:tentative="1">
+      <w:start w:val="1"/>
+      <w:numFmt w:val="bullet"/>
+      <w:lvlText w:val=""/>
+      <w:lvlJc w:val="left"/>
+      <w:pPr>
+        <w:tabs>
+          <w:tab w:val="num" w:pos="5760"/>
+        </w:tabs>
+        <w:ind w:left="5760" w:hanging="360"/>
+      </w:pPr>
+      <w:rPr>
+        <w:rFonts w:ascii="Wingdings" w:hAnsi="Wingdings" w:hint="default"/>
+        <w:sz w:val="20"/>
+      </w:rPr>
+    </w:lvl>
+    <w:lvl w:ilvl="8" w:tentative="1">
+      <w:start w:val="1"/>
+      <w:numFmt w:val="bullet"/>
+      <w:lvlText w:val=""/>
+      <w:lvlJc w:val="left"/>
+      <w:pPr>
+        <w:tabs>
+          <w:tab w:val="num" w:pos="6480"/>
+        </w:tabs>
+        <w:ind w:left="6480" w:hanging="360"/>
+      </w:pPr>
+      <w:rPr>
+        <w:rFonts w:ascii="Wingdings" w:hAnsi="Wingdings" w:hint="default"/>
+        <w:sz w:val="20"/>
+      </w:rPr>
+    </w:lvl>
+  </w:abstractNum>
+  <w:abstractNum w:abstractNumId="25" w15:restartNumberingAfterBreak="0">
+    <w:nsid w:val="72DF2C0A"/>
+    <w:multiLevelType w:val="multilevel"/>
+    <w:tmpl w:val="6B0654F0"/>
+    <w:lvl w:ilvl="0">
+      <w:start w:val="1"/>
+      <w:numFmt w:val="bullet"/>
+      <w:lvlText w:val=""/>
+      <w:lvlJc w:val="left"/>
+      <w:pPr>
+        <w:tabs>
+          <w:tab w:val="num" w:pos="720"/>
+        </w:tabs>
+        <w:ind w:left="720" w:hanging="360"/>
+      </w:pPr>
+      <w:rPr>
+        <w:rFonts w:ascii="Symbol" w:hAnsi="Symbol" w:hint="default"/>
+        <w:sz w:val="20"/>
+      </w:rPr>
+    </w:lvl>
+    <w:lvl w:ilvl="1" w:tentative="1">
+      <w:start w:val="1"/>
+      <w:numFmt w:val="bullet"/>
+      <w:lvlText w:val="o"/>
+      <w:lvlJc w:val="left"/>
+      <w:pPr>
+        <w:tabs>
+          <w:tab w:val="num" w:pos="1440"/>
+        </w:tabs>
+        <w:ind w:left="1440" w:hanging="360"/>
+      </w:pPr>
+      <w:rPr>
+        <w:rFonts w:ascii="Courier New" w:hAnsi="Courier New" w:hint="default"/>
+        <w:sz w:val="20"/>
+      </w:rPr>
+    </w:lvl>
+    <w:lvl w:ilvl="2" w:tentative="1">
+      <w:start w:val="1"/>
+      <w:numFmt w:val="bullet"/>
+      <w:lvlText w:val=""/>
+      <w:lvlJc w:val="left"/>
+      <w:pPr>
+        <w:tabs>
+          <w:tab w:val="num" w:pos="2160"/>
+        </w:tabs>
+        <w:ind w:left="2160" w:hanging="360"/>
+      </w:pPr>
+      <w:rPr>
+        <w:rFonts w:ascii="Wingdings" w:hAnsi="Wingdings" w:hint="default"/>
+        <w:sz w:val="20"/>
+      </w:rPr>
+    </w:lvl>
+    <w:lvl w:ilvl="3" w:tentative="1">
+      <w:start w:val="1"/>
+      <w:numFmt w:val="bullet"/>
+      <w:lvlText w:val=""/>
+      <w:lvlJc w:val="left"/>
+      <w:pPr>
+        <w:tabs>
+          <w:tab w:val="num" w:pos="2880"/>
+        </w:tabs>
+        <w:ind w:left="2880" w:hanging="360"/>
+      </w:pPr>
+      <w:rPr>
+        <w:rFonts w:ascii="Wingdings" w:hAnsi="Wingdings" w:hint="default"/>
+        <w:sz w:val="20"/>
+      </w:rPr>
+    </w:lvl>
+    <w:lvl w:ilvl="4" w:tentative="1">
+      <w:start w:val="1"/>
+      <w:numFmt w:val="bullet"/>
+      <w:lvlText w:val=""/>
+      <w:lvlJc w:val="left"/>
+      <w:pPr>
+        <w:tabs>
+          <w:tab w:val="num" w:pos="3600"/>
+        </w:tabs>
+        <w:ind w:left="3600" w:hanging="360"/>
+      </w:pPr>
+      <w:rPr>
+        <w:rFonts w:ascii="Wingdings" w:hAnsi="Wingdings" w:hint="default"/>
+        <w:sz w:val="20"/>
+      </w:rPr>
+    </w:lvl>
+    <w:lvl w:ilvl="5" w:tentative="1">
+      <w:start w:val="1"/>
+      <w:numFmt w:val="bullet"/>
+      <w:lvlText w:val=""/>
+      <w:lvlJc w:val="left"/>
+      <w:pPr>
+        <w:tabs>
+          <w:tab w:val="num" w:pos="4320"/>
+        </w:tabs>
+        <w:ind w:left="4320" w:hanging="360"/>
+      </w:pPr>
+      <w:rPr>
+        <w:rFonts w:ascii="Wingdings" w:hAnsi="Wingdings" w:hint="default"/>
+        <w:sz w:val="20"/>
+      </w:rPr>
+    </w:lvl>
+    <w:lvl w:ilvl="6" w:tentative="1">
+      <w:start w:val="1"/>
+      <w:numFmt w:val="bullet"/>
+      <w:lvlText w:val=""/>
+      <w:lvlJc w:val="left"/>
+      <w:pPr>
+        <w:tabs>
+          <w:tab w:val="num" w:pos="5040"/>
+        </w:tabs>
+        <w:ind w:left="5040" w:hanging="360"/>
+      </w:pPr>
+      <w:rPr>
+        <w:rFonts w:ascii="Wingdings" w:hAnsi="Wingdings" w:hint="default"/>
+        <w:sz w:val="20"/>
+      </w:rPr>
+    </w:lvl>
+    <w:lvl w:ilvl="7" w:tentative="1">
+      <w:start w:val="1"/>
+      <w:numFmt w:val="bullet"/>
+      <w:lvlText w:val=""/>
+      <w:lvlJc w:val="left"/>
+      <w:pPr>
+        <w:tabs>
+          <w:tab w:val="num" w:pos="5760"/>
+        </w:tabs>
+        <w:ind w:left="5760" w:hanging="360"/>
+      </w:pPr>
+      <w:rPr>
+        <w:rFonts w:ascii="Wingdings" w:hAnsi="Wingdings" w:hint="default"/>
+        <w:sz w:val="20"/>
+      </w:rPr>
+    </w:lvl>
+    <w:lvl w:ilvl="8" w:tentative="1">
+      <w:start w:val="1"/>
+      <w:numFmt w:val="bullet"/>
+      <w:lvlText w:val=""/>
+      <w:lvlJc w:val="left"/>
+      <w:pPr>
+        <w:tabs>
+          <w:tab w:val="num" w:pos="6480"/>
+        </w:tabs>
+        <w:ind w:left="6480" w:hanging="360"/>
+      </w:pPr>
+      <w:rPr>
+        <w:rFonts w:ascii="Wingdings" w:hAnsi="Wingdings" w:hint="default"/>
+        <w:sz w:val="20"/>
+      </w:rPr>
+    </w:lvl>
+  </w:abstractNum>
+  <w:abstractNum w:abstractNumId="26" w15:restartNumberingAfterBreak="0">
+    <w:nsid w:val="745121D0"/>
+    <w:multiLevelType w:val="multilevel"/>
+    <w:tmpl w:val="CDD04330"/>
     <w:lvl w:ilvl="0">
       <w:start w:val="1"/>
       <w:numFmt w:val="bullet"/>
@@ -6084,78 +6461,87 @@
     </w:lvl>
   </w:abstractNum>
   <w:num w:numId="1">
-    <w:abstractNumId w:val="2"/>
+    <w:abstractNumId w:val="21"/>
   </w:num>
   <w:num w:numId="2">
-    <w:abstractNumId w:val="14"/>
+    <w:abstractNumId w:val="11"/>
   </w:num>
   <w:num w:numId="3">
-    <w:abstractNumId w:val="21"/>
+    <w:abstractNumId w:val="17"/>
   </w:num>
   <w:num w:numId="4">
-    <w:abstractNumId w:val="0"/>
+    <w:abstractNumId w:val="2"/>
   </w:num>
   <w:num w:numId="5">
     <w:abstractNumId w:val="4"/>
   </w:num>
   <w:num w:numId="6">
+    <w:abstractNumId w:val="15"/>
+  </w:num>
+  <w:num w:numId="7">
+    <w:abstractNumId w:val="3"/>
+  </w:num>
+  <w:num w:numId="8">
+    <w:abstractNumId w:val="25"/>
+  </w:num>
+  <w:num w:numId="9">
+    <w:abstractNumId w:val="0"/>
+  </w:num>
+  <w:num w:numId="10">
+    <w:abstractNumId w:val="5"/>
+  </w:num>
+  <w:num w:numId="11">
+    <w:abstractNumId w:val="7"/>
+  </w:num>
+  <w:num w:numId="12">
+    <w:abstractNumId w:val="14"/>
+  </w:num>
+  <w:num w:numId="13">
     <w:abstractNumId w:val="8"/>
   </w:num>
-  <w:num w:numId="7">
-    <w:abstractNumId w:val="23"/>
+  <w:num w:numId="14">
+    <w:abstractNumId w:val="10"/>
   </w:num>
-  <w:num w:numId="8">
-    <w:abstractNumId w:val="3"/>
+  <w:num w:numId="15">
+    <w:abstractNumId w:val="22"/>
   </w:num>
-  <w:num w:numId="9">
-    <w:abstractNumId w:val="17"/>
+  <w:num w:numId="16">
+    <w:abstractNumId w:val="20"/>
   </w:num>
-  <w:num w:numId="10">
+  <w:num w:numId="17">
+    <w:abstractNumId w:val="6"/>
+  </w:num>
+  <w:num w:numId="18">
+    <w:abstractNumId w:val="12"/>
+  </w:num>
+  <w:num w:numId="19">
     <w:abstractNumId w:val="18"/>
   </w:num>
-  <w:num w:numId="11">
+  <w:num w:numId="20">
     <w:abstractNumId w:val="9"/>
-  </w:num>
-  <w:num w:numId="12">
-    <w:abstractNumId w:val="12"/>
-  </w:num>
-  <w:num w:numId="13">
-    <w:abstractNumId w:val="6"/>
-  </w:num>
-  <w:num w:numId="14">
-    <w:abstractNumId w:val="13"/>
-  </w:num>
-  <w:num w:numId="15">
-    <w:abstractNumId w:val="7"/>
-  </w:num>
-  <w:num w:numId="16">
-    <w:abstractNumId w:val="15"/>
-  </w:num>
-  <w:num w:numId="17">
-    <w:abstractNumId w:val="5"/>
-  </w:num>
-  <w:num w:numId="18">
-    <w:abstractNumId w:val="10"/>
-  </w:num>
-  <w:num w:numId="19">
-    <w:abstractNumId w:val="19"/>
-  </w:num>
-  <w:num w:numId="20">
-    <w:abstractNumId w:val="11"/>
   </w:num>
   <w:num w:numId="21">
     <w:abstractNumId w:val="16"/>
   </w:num>
   <w:num w:numId="22">
-    <w:abstractNumId w:val="20"/>
+    <w:abstractNumId w:val="19"/>
   </w:num>
   <w:num w:numId="23">
+    <w:abstractNumId w:val="23"/>
+  </w:num>
+  <w:num w:numId="24">
+    <w:abstractNumId w:val="26"/>
+  </w:num>
+  <w:num w:numId="25">
+    <w:abstractNumId w:val="24"/>
+  </w:num>
+  <w:num w:numId="26">
+    <w:abstractNumId w:val="13"/>
+  </w:num>
+  <w:num w:numId="27">
     <w:abstractNumId w:val="1"/>
   </w:num>
-  <w:num w:numId="24">
-    <w:abstractNumId w:val="22"/>
-  </w:num>
-  <w:numIdMacAtCleanup w:val="24"/>
+  <w:numIdMacAtCleanup w:val="27"/>
 </w:numbering>
 </file>
 

</xml_diff>